<commit_message>
Extending Part 2 + adding Part 3 with analysis
</commit_message>
<xml_diff>
--- a/sdt520-hw1.docx
+++ b/sdt520-hw1.docx
@@ -95,19 +95,8 @@
         <w:jc w:val="center"/>
       </w:pPr>
       <w:r>
-        <w:t>Instructor</w:t>
-      </w:r>
-      <w:r>
-        <w:t xml:space="preserve"> </w:t>
-      </w:r>
-      <w:r>
-        <w:t xml:space="preserve">Viktoria </w:t>
-      </w:r>
-      <w:proofErr w:type="spellStart"/>
-      <w:r>
-        <w:t>Makovska</w:t>
-      </w:r>
-      <w:proofErr w:type="spellEnd"/>
+        <w:t>Instructor Viktoria Makovska</w:t>
+      </w:r>
     </w:p>
     <w:p>
       <w:pPr>
@@ -234,10 +223,7 @@
         <w:spacing w:after="100" w:afterAutospacing="1" w:line="240" w:lineRule="auto"/>
       </w:pPr>
       <w:r>
-        <w:t>Part 1 — Conceptual and Logical Design</w:t>
-      </w:r>
-      <w:r>
-        <w:t xml:space="preserve"> / Vlad Saniuk </w:t>
+        <w:t xml:space="preserve">Part 1 — Conceptual and Logical Design / Vlad Saniuk </w:t>
       </w:r>
     </w:p>
     <w:p>
@@ -250,21 +236,7 @@
         <w:spacing w:after="100" w:afterAutospacing="1" w:line="240" w:lineRule="auto"/>
       </w:pPr>
       <w:r>
-        <w:t>Part 2 — Implementation and SQL Analytics</w:t>
-      </w:r>
-      <w:r>
-        <w:t xml:space="preserve"> / </w:t>
-      </w:r>
-      <w:r>
-        <w:t xml:space="preserve">Borys </w:t>
-      </w:r>
-      <w:proofErr w:type="spellStart"/>
-      <w:r>
-        <w:t>Guliaiev</w:t>
-      </w:r>
-      <w:proofErr w:type="spellEnd"/>
-      <w:r>
-        <w:t xml:space="preserve"> </w:t>
+        <w:t xml:space="preserve">Part 2 — Implementation and SQL Analytics / Borys Guliaiev </w:t>
       </w:r>
     </w:p>
     <w:p>
@@ -277,16 +249,13 @@
         <w:spacing w:after="100" w:afterAutospacing="1" w:line="240" w:lineRule="auto"/>
       </w:pPr>
       <w:r>
-        <w:t>Blood Donation — required queries (choose at least 4 of 6)</w:t>
-      </w:r>
-      <w:r>
-        <w:t xml:space="preserve"> / </w:t>
-      </w:r>
-      <w:r>
-        <w:t>Sofiia Lichman</w:t>
-      </w:r>
-      <w:r>
-        <w:t xml:space="preserve"> </w:t>
+        <w:t xml:space="preserve">Blood Donation — required queries (choose at least 4 of 6) / Sofiia Lichman </w:t>
+      </w:r>
+      <w:r>
+        <w:t xml:space="preserve">&amp; </w:t>
+      </w:r>
+      <w:r>
+        <w:t xml:space="preserve">Borys Guliaiev </w:t>
       </w:r>
     </w:p>
     <w:p>
@@ -299,16 +268,8 @@
         <w:spacing w:after="100" w:afterAutospacing="1" w:line="240" w:lineRule="auto"/>
       </w:pPr>
       <w:r>
-        <w:t xml:space="preserve">End-to-end verification / </w:t>
-      </w:r>
-      <w:r>
-        <w:t xml:space="preserve">Borys </w:t>
-      </w:r>
-      <w:proofErr w:type="spellStart"/>
-      <w:r>
-        <w:t>Guliaiev</w:t>
-      </w:r>
-      <w:proofErr w:type="spellEnd"/>
+        <w:t>End-to-end verification / Borys Guliaiev</w:t>
+      </w:r>
     </w:p>
     <w:p>
       <w:pPr>
@@ -333,8 +294,26 @@
         <w:ind w:firstLine="0"/>
         <w:rPr>
           <w:b/>
-        </w:rPr>
-      </w:pPr>
+          <w:lang w:val="ru-RU"/>
+        </w:rPr>
+      </w:pPr>
+    </w:p>
+    <w:p>
+      <w:pPr>
+        <w:pStyle w:val="Heading1"/>
+        <w:jc w:val="left"/>
+        <w:rPr>
+          <w:rFonts w:cs="Times New Roman"/>
+          <w:szCs w:val="24"/>
+        </w:rPr>
+      </w:pPr>
+      <w:r>
+        <w:rPr>
+          <w:rFonts w:cs="Times New Roman"/>
+          <w:szCs w:val="24"/>
+        </w:rPr>
+        <w:t>Part 1 – Conceptual design</w:t>
+      </w:r>
     </w:p>
     <w:p>
       <w:pPr>
@@ -350,21 +329,7 @@
           <w:b/>
           <w:bCs/>
         </w:rPr>
-        <w:t xml:space="preserve">Team </w:t>
-      </w:r>
-      <w:r>
-        <w:rPr>
-          <w:b/>
-          <w:bCs/>
-        </w:rPr>
-        <w:t>discussion</w:t>
-      </w:r>
-      <w:r>
-        <w:rPr>
-          <w:b/>
-          <w:bCs/>
-        </w:rPr>
-        <w:t xml:space="preserve">: </w:t>
+        <w:t xml:space="preserve">Team discussion: </w:t>
       </w:r>
     </w:p>
     <w:p>
@@ -423,11 +388,314 @@
     </w:p>
     <w:p>
       <w:pPr>
-        <w:ind w:firstLine="0"/>
-        <w:rPr>
-          <w:bCs/>
-        </w:rPr>
-      </w:pPr>
+        <w:pStyle w:val="NormalWeb"/>
+      </w:pPr>
+      <w:r>
+        <w:rPr>
+          <w:rStyle w:val="Strong"/>
+        </w:rPr>
+        <w:t>Core entities</w:t>
+      </w:r>
+    </w:p>
+    <w:p>
+      <w:pPr>
+        <w:pStyle w:val="NormalWeb"/>
+        <w:numPr>
+          <w:ilvl w:val="0"/>
+          <w:numId w:val="19"/>
+        </w:numPr>
+      </w:pPr>
+      <w:r>
+        <w:rPr>
+          <w:rStyle w:val="Strong"/>
+        </w:rPr>
+        <w:t>donor</w:t>
+      </w:r>
+      <w:r>
+        <w:t>: people who can donate blood</w:t>
+      </w:r>
+    </w:p>
+    <w:p>
+      <w:pPr>
+        <w:pStyle w:val="NormalWeb"/>
+        <w:numPr>
+          <w:ilvl w:val="0"/>
+          <w:numId w:val="19"/>
+        </w:numPr>
+      </w:pPr>
+      <w:r>
+        <w:rPr>
+          <w:rStyle w:val="Strong"/>
+        </w:rPr>
+        <w:t>center</w:t>
+      </w:r>
+      <w:r>
+        <w:t>: blood banks/centers</w:t>
+      </w:r>
+    </w:p>
+    <w:p>
+      <w:pPr>
+        <w:pStyle w:val="NormalWeb"/>
+        <w:numPr>
+          <w:ilvl w:val="0"/>
+          <w:numId w:val="19"/>
+        </w:numPr>
+      </w:pPr>
+      <w:r>
+        <w:rPr>
+          <w:rStyle w:val="Strong"/>
+        </w:rPr>
+        <w:t>donation</w:t>
+      </w:r>
+      <w:r>
+        <w:t>: a donation event made by a donor at a center</w:t>
+      </w:r>
+    </w:p>
+    <w:p>
+      <w:pPr>
+        <w:pStyle w:val="NormalWeb"/>
+        <w:numPr>
+          <w:ilvl w:val="0"/>
+          <w:numId w:val="19"/>
+        </w:numPr>
+      </w:pPr>
+      <w:r>
+        <w:rPr>
+          <w:rStyle w:val="Strong"/>
+        </w:rPr>
+        <w:t>request</w:t>
+      </w:r>
+      <w:r>
+        <w:t>: a request from a center for blood units/volume, blood type, urgency</w:t>
+      </w:r>
+    </w:p>
+    <w:p>
+      <w:pPr>
+        <w:pStyle w:val="NormalWeb"/>
+        <w:numPr>
+          <w:ilvl w:val="0"/>
+          <w:numId w:val="19"/>
+        </w:numPr>
+      </w:pPr>
+      <w:r>
+        <w:rPr>
+          <w:rStyle w:val="Strong"/>
+        </w:rPr>
+        <w:t>inventory_unit</w:t>
+      </w:r>
+      <w:r>
+        <w:t>: units created from donations and stored in centers (tracks availability, expiry)</w:t>
+      </w:r>
+    </w:p>
+    <w:p>
+      <w:pPr>
+        <w:pStyle w:val="NormalWeb"/>
+        <w:numPr>
+          <w:ilvl w:val="0"/>
+          <w:numId w:val="19"/>
+        </w:numPr>
+      </w:pPr>
+      <w:r>
+        <w:rPr>
+          <w:rStyle w:val="Strong"/>
+        </w:rPr>
+        <w:t>fulfillment</w:t>
+      </w:r>
+      <w:r>
+        <w:t>: allocation of inventory units to requests (supports “unfulfilled” logic)</w:t>
+      </w:r>
+    </w:p>
+    <w:p>
+      <w:pPr>
+        <w:pStyle w:val="NormalWeb"/>
+      </w:pPr>
+      <w:r>
+        <w:rPr>
+          <w:rStyle w:val="Strong"/>
+        </w:rPr>
+        <w:t>Key modeling decisions &amp; trade-offs (copy into Design Discussion)</w:t>
+      </w:r>
+    </w:p>
+    <w:p>
+      <w:pPr>
+        <w:pStyle w:val="NormalWeb"/>
+        <w:numPr>
+          <w:ilvl w:val="0"/>
+          <w:numId w:val="20"/>
+        </w:numPr>
+      </w:pPr>
+      <w:r>
+        <w:rPr>
+          <w:rStyle w:val="Strong"/>
+        </w:rPr>
+        <w:t>Blood type</w:t>
+      </w:r>
+      <w:r>
+        <w:t xml:space="preserve"> is stored as an enum-like constrained text (</w:t>
+      </w:r>
+      <w:r>
+        <w:rPr>
+          <w:rStyle w:val="HTMLCode"/>
+          <w:rFonts w:ascii="Times New Roman" w:hAnsi="Times New Roman" w:cs="Times New Roman"/>
+          <w:sz w:val="24"/>
+          <w:szCs w:val="24"/>
+        </w:rPr>
+        <w:t>A+</w:t>
+      </w:r>
+      <w:r>
+        <w:t xml:space="preserve">, </w:t>
+      </w:r>
+      <w:r>
+        <w:rPr>
+          <w:rStyle w:val="HTMLCode"/>
+          <w:rFonts w:ascii="Times New Roman" w:hAnsi="Times New Roman" w:cs="Times New Roman"/>
+          <w:sz w:val="24"/>
+          <w:szCs w:val="24"/>
+        </w:rPr>
+        <w:t>A-</w:t>
+      </w:r>
+      <w:r>
+        <w:t xml:space="preserve">, </w:t>
+      </w:r>
+      <w:r>
+        <w:rPr>
+          <w:rStyle w:val="HTMLCode"/>
+          <w:rFonts w:ascii="Times New Roman" w:hAnsi="Times New Roman" w:cs="Times New Roman"/>
+          <w:sz w:val="24"/>
+          <w:szCs w:val="24"/>
+        </w:rPr>
+        <w:t>B+</w:t>
+      </w:r>
+      <w:r>
+        <w:t xml:space="preserve">, </w:t>
+      </w:r>
+      <w:r>
+        <w:rPr>
+          <w:rStyle w:val="HTMLCode"/>
+          <w:rFonts w:ascii="Times New Roman" w:hAnsi="Times New Roman" w:cs="Times New Roman"/>
+          <w:sz w:val="24"/>
+          <w:szCs w:val="24"/>
+        </w:rPr>
+        <w:t>B-</w:t>
+      </w:r>
+      <w:r>
+        <w:t xml:space="preserve">, </w:t>
+      </w:r>
+      <w:r>
+        <w:rPr>
+          <w:rStyle w:val="HTMLCode"/>
+          <w:rFonts w:ascii="Times New Roman" w:hAnsi="Times New Roman" w:cs="Times New Roman"/>
+          <w:sz w:val="24"/>
+          <w:szCs w:val="24"/>
+        </w:rPr>
+        <w:t>AB+</w:t>
+      </w:r>
+      <w:r>
+        <w:t xml:space="preserve">, </w:t>
+      </w:r>
+      <w:r>
+        <w:rPr>
+          <w:rStyle w:val="HTMLCode"/>
+          <w:rFonts w:ascii="Times New Roman" w:hAnsi="Times New Roman" w:cs="Times New Roman"/>
+          <w:sz w:val="24"/>
+          <w:szCs w:val="24"/>
+        </w:rPr>
+        <w:t>AB-</w:t>
+      </w:r>
+      <w:r>
+        <w:t xml:space="preserve">, </w:t>
+      </w:r>
+      <w:r>
+        <w:rPr>
+          <w:rStyle w:val="HTMLCode"/>
+          <w:rFonts w:ascii="Times New Roman" w:hAnsi="Times New Roman" w:cs="Times New Roman"/>
+          <w:sz w:val="24"/>
+          <w:szCs w:val="24"/>
+        </w:rPr>
+        <w:t>O+</w:t>
+      </w:r>
+      <w:r>
+        <w:t xml:space="preserve">, </w:t>
+      </w:r>
+      <w:r>
+        <w:rPr>
+          <w:rStyle w:val="HTMLCode"/>
+          <w:rFonts w:ascii="Times New Roman" w:hAnsi="Times New Roman" w:cs="Times New Roman"/>
+          <w:sz w:val="24"/>
+          <w:szCs w:val="24"/>
+        </w:rPr>
+        <w:t>O-</w:t>
+      </w:r>
+      <w:r>
+        <w:t xml:space="preserve">) via </w:t>
+      </w:r>
+      <w:r>
+        <w:rPr>
+          <w:rStyle w:val="HTMLCode"/>
+          <w:rFonts w:ascii="Times New Roman" w:hAnsi="Times New Roman" w:cs="Times New Roman"/>
+          <w:sz w:val="24"/>
+          <w:szCs w:val="24"/>
+        </w:rPr>
+        <w:t>CHECK</w:t>
+      </w:r>
+      <w:r>
+        <w:t>. This keeps schema portable and enforces data quality.</w:t>
+      </w:r>
+    </w:p>
+    <w:p>
+      <w:pPr>
+        <w:pStyle w:val="NormalWeb"/>
+        <w:numPr>
+          <w:ilvl w:val="0"/>
+          <w:numId w:val="20"/>
+        </w:numPr>
+      </w:pPr>
+      <w:r>
+        <w:rPr>
+          <w:rStyle w:val="Strong"/>
+        </w:rPr>
+        <w:t>Inventory as first-class</w:t>
+      </w:r>
+      <w:r>
+        <w:t xml:space="preserve"> entity (not just donation volume) to enable “match requests to inventory and show unfulfilled” queries.</w:t>
+      </w:r>
+    </w:p>
+    <w:p>
+      <w:pPr>
+        <w:pStyle w:val="NormalWeb"/>
+        <w:numPr>
+          <w:ilvl w:val="0"/>
+          <w:numId w:val="20"/>
+        </w:numPr>
+      </w:pPr>
+      <w:r>
+        <w:rPr>
+          <w:rStyle w:val="Strong"/>
+        </w:rPr>
+        <w:lastRenderedPageBreak/>
+        <w:t>Eligibility rule</w:t>
+      </w:r>
+      <w:r>
+        <w:t xml:space="preserve"> implemented as “donor can donate again after 56 days” (typical whole blood rule). This is a business rule, not a medical guarantee; documented as an assumption.</w:t>
+      </w:r>
+    </w:p>
+    <w:p>
+      <w:pPr>
+        <w:pStyle w:val="NormalWeb"/>
+        <w:numPr>
+          <w:ilvl w:val="0"/>
+          <w:numId w:val="20"/>
+        </w:numPr>
+      </w:pPr>
+      <w:r>
+        <w:rPr>
+          <w:rStyle w:val="Strong"/>
+        </w:rPr>
+        <w:t>3NF</w:t>
+      </w:r>
+      <w:r>
+        <w:t>: attributes depend on keys only; no repeated groups; fulfillment separated from request and inventory_unit to avoid many-to-many inline columns.</w:t>
+      </w:r>
     </w:p>
     <w:p>
       <w:pPr>
@@ -476,30 +744,8 @@
         <w:rPr>
           <w:bCs/>
         </w:rPr>
-        <w:t xml:space="preserve">Remove multiple “last Y date” as those can be derived by </w:t>
-      </w:r>
-      <w:proofErr w:type="spellStart"/>
-      <w:r>
-        <w:rPr>
-          <w:bCs/>
-        </w:rPr>
-        <w:t>JOINing</w:t>
-      </w:r>
-      <w:proofErr w:type="spellEnd"/>
-      <w:r>
-        <w:rPr>
-          <w:bCs/>
-        </w:rPr>
-        <w:t xml:space="preserve"> other tables</w:t>
-      </w:r>
-    </w:p>
-    <w:p>
-      <w:pPr>
-        <w:ind w:firstLine="0"/>
-        <w:rPr>
-          <w:bCs/>
-        </w:rPr>
-      </w:pPr>
+        <w:t>Remove multiple “last Y date” as those can be derived by JOINing other tables</w:t>
+      </w:r>
     </w:p>
     <w:p>
       <w:pPr>
@@ -542,22 +788,13 @@
         <w:adjustRightInd w:val="0"/>
         <w:spacing w:line="240" w:lineRule="auto"/>
         <w:ind w:firstLine="0"/>
-        <w:rPr>
-          <w:rFonts w:ascii="Helvetica Neue" w:hAnsi="Helvetica Neue" w:cs="Helvetica Neue"/>
-          <w:sz w:val="26"/>
-          <w:szCs w:val="26"/>
-        </w:rPr>
-      </w:pPr>
-      <w:r>
-        <w:rPr>
-          <w:rFonts w:ascii="Helvetica Neue" w:hAnsi="Helvetica Neue" w:cs="Helvetica Neue"/>
+      </w:pPr>
+      <w:r>
+        <w:rPr>
           <w:noProof/>
-          <w:sz w:val="26"/>
-          <w:szCs w:val="26"/>
-        </w:rPr>
-        <w:lastRenderedPageBreak/>
+        </w:rPr>
         <w:drawing>
-          <wp:inline distT="0" distB="0" distL="0" distR="0" wp14:anchorId="21C99621" wp14:editId="2D511DDA">
+          <wp:inline distT="0" distB="0" distL="0" distR="0" wp14:anchorId="21C99621" wp14:editId="2C5CE1E4">
             <wp:extent cx="5943600" cy="2984500"/>
             <wp:effectExtent l="0" t="0" r="0" b="0"/>
             <wp:docPr id="31820808" name="Picture 1"/>
@@ -616,13 +853,7 @@
         <w:rPr>
           <w:b/>
         </w:rPr>
-        <w:t xml:space="preserve">Figure </w:t>
-      </w:r>
-      <w:r>
-        <w:rPr>
-          <w:b/>
-        </w:rPr>
-        <w:t>2</w:t>
+        <w:t>Figure 2</w:t>
       </w:r>
     </w:p>
     <w:p>
@@ -636,26 +867,25 @@
         <w:rPr>
           <w:i/>
         </w:rPr>
-        <w:t>R</w:t>
-      </w:r>
-      <w:r>
+        <w:t>Relational schema.</w:t>
+      </w:r>
+    </w:p>
+    <w:p>
+      <w:pPr>
+        <w:ind w:firstLine="0"/>
         <w:rPr>
           <w:i/>
         </w:rPr>
-        <w:t>elational schem</w:t>
-      </w:r>
-      <w:r>
-        <w:rPr>
-          <w:i/>
-        </w:rPr>
-        <w:t>a</w:t>
-      </w:r>
-      <w:r>
-        <w:rPr>
-          <w:i/>
-        </w:rPr>
-        <w:t>.</w:t>
-      </w:r>
+      </w:pPr>
+    </w:p>
+    <w:p>
+      <w:pPr>
+        <w:ind w:firstLine="0"/>
+        <w:rPr>
+          <w:iCs/>
+          <w:lang w:val="ru-RU"/>
+        </w:rPr>
+      </w:pPr>
     </w:p>
     <w:p>
       <w:pPr>
@@ -726,10 +956,1453 @@
         </w:rPr>
       </w:pPr>
     </w:p>
+    <w:p>
+      <w:pPr>
+        <w:spacing w:after="100" w:afterAutospacing="1" w:line="240" w:lineRule="auto"/>
+        <w:ind w:firstLine="0"/>
+        <w:rPr>
+          <w:b/>
+          <w:color w:val="FF0000"/>
+        </w:rPr>
+      </w:pPr>
+    </w:p>
+    <w:p>
+      <w:pPr>
+        <w:pStyle w:val="Heading1"/>
+        <w:jc w:val="left"/>
+        <w:rPr>
+          <w:rFonts w:cs="Times New Roman"/>
+          <w:szCs w:val="24"/>
+        </w:rPr>
+      </w:pPr>
+      <w:r>
+        <w:rPr>
+          <w:rFonts w:cs="Times New Roman"/>
+          <w:szCs w:val="24"/>
+        </w:rPr>
+        <w:lastRenderedPageBreak/>
+        <w:t>Part 2 – Implementation</w:t>
+      </w:r>
+    </w:p>
+    <w:p>
+      <w:pPr>
+        <w:ind w:firstLine="0"/>
+      </w:pPr>
+      <w:r>
+        <w:t>DDL: create the database schema (tables + constraints).</w:t>
+      </w:r>
+    </w:p>
+    <w:p>
+      <w:pPr>
+        <w:spacing w:after="100" w:afterAutospacing="1" w:line="240" w:lineRule="auto"/>
+        <w:ind w:firstLine="0"/>
+        <w:rPr>
+          <w:b/>
+          <w:color w:val="FF0000"/>
+        </w:rPr>
+      </w:pPr>
+      <w:r>
+        <w:rPr>
+          <w:b/>
+          <w:color w:val="FF0000"/>
+        </w:rPr>
+        <w:object w:dxaOrig="1539" w:dyaOrig="996" w14:anchorId="27D235F7">
+          <v:shapetype id="_x0000_t75" coordsize="21600,21600" o:spt="75" o:preferrelative="t" path="m@4@5l@4@11@9@11@9@5xe" filled="f" stroked="f">
+            <v:stroke joinstyle="miter"/>
+            <v:formulas>
+              <v:f eqn="if lineDrawn pixelLineWidth 0"/>
+              <v:f eqn="sum @0 1 0"/>
+              <v:f eqn="sum 0 0 @1"/>
+              <v:f eqn="prod @2 1 2"/>
+              <v:f eqn="prod @3 21600 pixelWidth"/>
+              <v:f eqn="prod @3 21600 pixelHeight"/>
+              <v:f eqn="sum @0 0 1"/>
+              <v:f eqn="prod @6 1 2"/>
+              <v:f eqn="prod @7 21600 pixelWidth"/>
+              <v:f eqn="sum @8 21600 0"/>
+              <v:f eqn="prod @7 21600 pixelHeight"/>
+              <v:f eqn="sum @10 21600 0"/>
+            </v:formulas>
+            <v:path o:extrusionok="f" gradientshapeok="t" o:connecttype="rect"/>
+            <o:lock v:ext="edit" aspectratio="t"/>
+          </v:shapetype>
+          <v:shape id="_x0000_i1025" type="#_x0000_t75" style="width:77.25pt;height:49.5pt" o:ole="">
+            <v:imagedata r:id="rId9" o:title=""/>
+          </v:shape>
+          <o:OLEObject Type="Embed" ProgID="Package" ShapeID="_x0000_i1025" DrawAspect="Icon" ObjectID="_1834055706" r:id="rId10"/>
+        </w:object>
+      </w:r>
+    </w:p>
+    <w:p>
+      <w:pPr>
+        <w:spacing w:after="100" w:afterAutospacing="1" w:line="240" w:lineRule="auto"/>
+        <w:ind w:firstLine="0"/>
+      </w:pPr>
+      <w:r>
+        <w:t>Data: insert sample data generated with any automation tool (Python, faker library, SQL generate_series,</w:t>
+      </w:r>
+      <w:r>
+        <w:t xml:space="preserve"> </w:t>
+      </w:r>
+      <w:r>
+        <w:t>etc.).</w:t>
+      </w:r>
+    </w:p>
+    <w:p>
+      <w:pPr>
+        <w:spacing w:after="100" w:afterAutospacing="1" w:line="240" w:lineRule="auto"/>
+        <w:ind w:firstLine="0"/>
+      </w:pPr>
+      <w:r>
+        <w:object w:dxaOrig="1539" w:dyaOrig="996" w14:anchorId="403ED1D6">
+          <v:shape id="_x0000_i1030" type="#_x0000_t75" style="width:77.25pt;height:49.5pt" o:ole="">
+            <v:imagedata r:id="rId11" o:title=""/>
+          </v:shape>
+          <o:OLEObject Type="Embed" ProgID="Package" ShapeID="_x0000_i1030" DrawAspect="Icon" ObjectID="_1834055707" r:id="rId12"/>
+        </w:object>
+      </w:r>
+    </w:p>
+    <w:p>
+      <w:pPr>
+        <w:autoSpaceDE w:val="0"/>
+        <w:autoSpaceDN w:val="0"/>
+        <w:adjustRightInd w:val="0"/>
+        <w:spacing w:line="240" w:lineRule="auto"/>
+        <w:ind w:firstLine="0"/>
+        <w:rPr>
+          <w:b/>
+          <w:bCs/>
+        </w:rPr>
+      </w:pPr>
+      <w:r>
+        <w:rPr>
+          <w:b/>
+          <w:bCs/>
+        </w:rPr>
+        <w:t>Scenario Minimum entities / records (baseline)</w:t>
+      </w:r>
+    </w:p>
+    <w:p>
+      <w:pPr>
+        <w:autoSpaceDE w:val="0"/>
+        <w:autoSpaceDN w:val="0"/>
+        <w:adjustRightInd w:val="0"/>
+        <w:spacing w:line="240" w:lineRule="auto"/>
+        <w:ind w:firstLine="0"/>
+      </w:pPr>
+      <w:r>
+        <w:t>Blood Donation &gt;= 40 donors; &gt;= 5 blood banks/centers; &gt;= 20 donations; &gt;= 15 requests</w:t>
+      </w:r>
+    </w:p>
+    <w:p>
+      <w:pPr>
+        <w:autoSpaceDE w:val="0"/>
+        <w:autoSpaceDN w:val="0"/>
+        <w:adjustRightInd w:val="0"/>
+        <w:spacing w:line="240" w:lineRule="auto"/>
+        <w:ind w:firstLine="0"/>
+      </w:pPr>
+    </w:p>
+    <w:p>
+      <w:pPr>
+        <w:autoSpaceDE w:val="0"/>
+        <w:autoSpaceDN w:val="0"/>
+        <w:adjustRightInd w:val="0"/>
+        <w:spacing w:line="240" w:lineRule="auto"/>
+        <w:ind w:firstLine="0"/>
+      </w:pPr>
+    </w:p>
+    <w:p>
+      <w:pPr>
+        <w:autoSpaceDE w:val="0"/>
+        <w:autoSpaceDN w:val="0"/>
+        <w:adjustRightInd w:val="0"/>
+        <w:spacing w:line="240" w:lineRule="auto"/>
+        <w:ind w:firstLine="0"/>
+      </w:pPr>
+    </w:p>
+    <w:p>
+      <w:pPr>
+        <w:autoSpaceDE w:val="0"/>
+        <w:autoSpaceDN w:val="0"/>
+        <w:adjustRightInd w:val="0"/>
+        <w:spacing w:line="240" w:lineRule="auto"/>
+        <w:ind w:firstLine="0"/>
+        <w:rPr>
+          <w:b/>
+          <w:bCs/>
+          <w:kern w:val="32"/>
+        </w:rPr>
+      </w:pPr>
+      <w:r>
+        <w:rPr>
+          <w:b/>
+          <w:bCs/>
+          <w:kern w:val="32"/>
+        </w:rPr>
+        <w:t>Part 3 - Analysis</w:t>
+      </w:r>
+    </w:p>
+    <w:p>
+      <w:pPr>
+        <w:autoSpaceDE w:val="0"/>
+        <w:autoSpaceDN w:val="0"/>
+        <w:adjustRightInd w:val="0"/>
+        <w:spacing w:line="240" w:lineRule="auto"/>
+        <w:ind w:firstLine="0"/>
+      </w:pPr>
+    </w:p>
+    <w:p>
+      <w:pPr>
+        <w:autoSpaceDE w:val="0"/>
+        <w:autoSpaceDN w:val="0"/>
+        <w:adjustRightInd w:val="0"/>
+        <w:spacing w:line="240" w:lineRule="auto"/>
+        <w:ind w:firstLine="0"/>
+      </w:pPr>
+      <w:r>
+        <w:object w:dxaOrig="1539" w:dyaOrig="996" w14:anchorId="51584E34">
+          <v:shape id="_x0000_i1031" type="#_x0000_t75" style="width:77.25pt;height:49.5pt" o:ole="">
+            <v:imagedata r:id="rId13" o:title=""/>
+          </v:shape>
+          <o:OLEObject Type="Embed" ProgID="Package" ShapeID="_x0000_i1031" DrawAspect="Icon" ObjectID="_1834055708" r:id="rId14"/>
+        </w:object>
+      </w:r>
+    </w:p>
+    <w:p>
+      <w:pPr>
+        <w:autoSpaceDE w:val="0"/>
+        <w:autoSpaceDN w:val="0"/>
+        <w:adjustRightInd w:val="0"/>
+        <w:spacing w:line="240" w:lineRule="auto"/>
+        <w:ind w:firstLine="0"/>
+      </w:pPr>
+      <w:r>
+        <w:t>The queries.sql file contains analytical and operational SQL queries developed to satisfy the functional requirements of the Blood Donation scenario. The queries demonstrate proper usage of joins, aggregation, filtering, window functions, and Common Table Expressions (CTEs), while reflecting real-world operational needs of a blood coordination system.</w:t>
+      </w:r>
+    </w:p>
+    <w:p>
+      <w:pPr>
+        <w:autoSpaceDE w:val="0"/>
+        <w:autoSpaceDN w:val="0"/>
+        <w:adjustRightInd w:val="0"/>
+        <w:spacing w:line="240" w:lineRule="auto"/>
+        <w:ind w:firstLine="0"/>
+      </w:pPr>
+    </w:p>
+    <w:p>
+      <w:pPr>
+        <w:pStyle w:val="Heading2"/>
+        <w:rPr>
+          <w:rFonts w:cs="Times New Roman"/>
+          <w:sz w:val="36"/>
+          <w:szCs w:val="36"/>
+        </w:rPr>
+      </w:pPr>
+      <w:r>
+        <w:rPr>
+          <w:rFonts w:cs="Times New Roman"/>
+        </w:rPr>
+        <w:t xml:space="preserve">1. </w:t>
+      </w:r>
+      <w:r>
+        <w:rPr>
+          <w:rFonts w:cs="Times New Roman"/>
+        </w:rPr>
+        <w:t xml:space="preserve">Active donors who donated in the last </w:t>
+      </w:r>
+      <w:r>
+        <w:rPr>
+          <w:rFonts w:cs="Times New Roman"/>
+        </w:rPr>
+        <w:t>7 Days</w:t>
+      </w:r>
+    </w:p>
+    <w:p>
+      <w:pPr>
+        <w:pStyle w:val="NormalWeb"/>
+      </w:pPr>
+      <w:r>
+        <w:rPr>
+          <w:rStyle w:val="Strong"/>
+        </w:rPr>
+        <w:t>Type:</w:t>
+      </w:r>
+      <w:r>
+        <w:t xml:space="preserve"> Operational Query</w:t>
+      </w:r>
+    </w:p>
+    <w:p>
+      <w:pPr>
+        <w:pStyle w:val="NormalWeb"/>
+      </w:pPr>
+      <w:r>
+        <w:t>This query identifies donors who:</w:t>
+      </w:r>
+    </w:p>
+    <w:p>
+      <w:pPr>
+        <w:pStyle w:val="NormalWeb"/>
+        <w:numPr>
+          <w:ilvl w:val="0"/>
+          <w:numId w:val="21"/>
+        </w:numPr>
+      </w:pPr>
+      <w:r>
+        <w:t>Are currently eligible for donation (</w:t>
+      </w:r>
+      <w:r>
+        <w:rPr>
+          <w:rStyle w:val="HTMLCode"/>
+          <w:rFonts w:ascii="Times New Roman" w:hAnsi="Times New Roman" w:cs="Times New Roman"/>
+        </w:rPr>
+        <w:t>is_eligible_for_donation = TRUE</w:t>
+      </w:r>
+      <w:r>
+        <w:t>)</w:t>
+      </w:r>
+    </w:p>
+    <w:p>
+      <w:pPr>
+        <w:pStyle w:val="NormalWeb"/>
+        <w:numPr>
+          <w:ilvl w:val="0"/>
+          <w:numId w:val="21"/>
+        </w:numPr>
+      </w:pPr>
+      <w:r>
+        <w:t>Have made a donation within the last 7 days</w:t>
+      </w:r>
+    </w:p>
+    <w:p>
+      <w:pPr>
+        <w:pStyle w:val="NormalWeb"/>
+      </w:pPr>
+      <w:r>
+        <w:t xml:space="preserve">It joins </w:t>
+      </w:r>
+      <w:r>
+        <w:rPr>
+          <w:rStyle w:val="HTMLCode"/>
+          <w:rFonts w:ascii="Times New Roman" w:hAnsi="Times New Roman" w:cs="Times New Roman"/>
+        </w:rPr>
+        <w:t>donor</w:t>
+      </w:r>
+      <w:r>
+        <w:t xml:space="preserve"> and </w:t>
+      </w:r>
+      <w:r>
+        <w:rPr>
+          <w:rStyle w:val="HTMLCode"/>
+          <w:rFonts w:ascii="Times New Roman" w:hAnsi="Times New Roman" w:cs="Times New Roman"/>
+        </w:rPr>
+        <w:t>donation</w:t>
+      </w:r>
+      <w:r>
+        <w:t xml:space="preserve"> tables and filters based on recent dates.</w:t>
+      </w:r>
+    </w:p>
+    <w:p>
+      <w:pPr>
+        <w:pStyle w:val="NormalWeb"/>
+      </w:pPr>
+      <w:r>
+        <w:rPr>
+          <w:rStyle w:val="Strong"/>
+        </w:rPr>
+        <w:t xml:space="preserve">Business </w:t>
+      </w:r>
+      <w:r>
+        <w:rPr>
+          <w:rStyle w:val="Strong"/>
+        </w:rPr>
+        <w:t>purpose</w:t>
+      </w:r>
+      <w:r>
+        <w:rPr>
+          <w:rStyle w:val="Strong"/>
+        </w:rPr>
+        <w:t>:</w:t>
+      </w:r>
+      <w:r>
+        <w:rPr>
+          <w:rStyle w:val="Strong"/>
+        </w:rPr>
+        <w:t xml:space="preserve"> </w:t>
+      </w:r>
+      <w:r>
+        <w:t>Supports operational monitoring of active donors and helps clinics track recent donation activity.</w:t>
+      </w:r>
+    </w:p>
+    <w:p>
+      <w:pPr>
+        <w:pStyle w:val="Heading2"/>
+        <w:rPr>
+          <w:rFonts w:cs="Times New Roman"/>
+        </w:rPr>
+      </w:pPr>
+      <w:r>
+        <w:rPr>
+          <w:rFonts w:cs="Times New Roman"/>
+        </w:rPr>
+        <w:lastRenderedPageBreak/>
+        <w:t xml:space="preserve">2. </w:t>
+      </w:r>
+      <w:r>
+        <w:rPr>
+          <w:rFonts w:cs="Times New Roman"/>
+        </w:rPr>
+        <w:t>Blood recipient clinics with highest number of requests in the last 3 days</w:t>
+      </w:r>
+    </w:p>
+    <w:p>
+      <w:pPr>
+        <w:pStyle w:val="NormalWeb"/>
+      </w:pPr>
+      <w:r>
+        <w:rPr>
+          <w:rStyle w:val="Strong"/>
+        </w:rPr>
+        <w:t>Type:</w:t>
+      </w:r>
+      <w:r>
+        <w:t xml:space="preserve"> Analytical Query</w:t>
+      </w:r>
+    </w:p>
+    <w:p>
+      <w:pPr>
+        <w:pStyle w:val="NormalWeb"/>
+      </w:pPr>
+      <w:r>
+        <w:t xml:space="preserve">This query aggregates requests from the </w:t>
+      </w:r>
+      <w:r>
+        <w:rPr>
+          <w:rStyle w:val="HTMLCode"/>
+          <w:rFonts w:ascii="Times New Roman" w:hAnsi="Times New Roman" w:cs="Times New Roman"/>
+        </w:rPr>
+        <w:t>blood_request</w:t>
+      </w:r>
+      <w:r>
+        <w:t xml:space="preserve"> table over the last three days and groups them by recipient clinic.</w:t>
+      </w:r>
+    </w:p>
+    <w:p>
+      <w:pPr>
+        <w:pStyle w:val="NormalWeb"/>
+      </w:pPr>
+      <w:r>
+        <w:t>It uses:</w:t>
+      </w:r>
+    </w:p>
+    <w:p>
+      <w:pPr>
+        <w:pStyle w:val="NormalWeb"/>
+        <w:numPr>
+          <w:ilvl w:val="0"/>
+          <w:numId w:val="22"/>
+        </w:numPr>
+      </w:pPr>
+      <w:r>
+        <w:t xml:space="preserve">JOIN between </w:t>
+      </w:r>
+      <w:r>
+        <w:rPr>
+          <w:rStyle w:val="HTMLCode"/>
+          <w:rFonts w:ascii="Times New Roman" w:hAnsi="Times New Roman" w:cs="Times New Roman"/>
+        </w:rPr>
+        <w:t>blood_request</w:t>
+      </w:r>
+      <w:r>
+        <w:t xml:space="preserve"> and </w:t>
+      </w:r>
+      <w:r>
+        <w:rPr>
+          <w:rStyle w:val="HTMLCode"/>
+          <w:rFonts w:ascii="Times New Roman" w:hAnsi="Times New Roman" w:cs="Times New Roman"/>
+        </w:rPr>
+        <w:t>blood_recipient_clinic</w:t>
+      </w:r>
+    </w:p>
+    <w:p>
+      <w:pPr>
+        <w:pStyle w:val="NormalWeb"/>
+        <w:numPr>
+          <w:ilvl w:val="0"/>
+          <w:numId w:val="22"/>
+        </w:numPr>
+      </w:pPr>
+      <w:r>
+        <w:rPr>
+          <w:rStyle w:val="HTMLCode"/>
+          <w:rFonts w:ascii="Times New Roman" w:hAnsi="Times New Roman" w:cs="Times New Roman"/>
+        </w:rPr>
+        <w:t>GROUP BY</w:t>
+      </w:r>
+    </w:p>
+    <w:p>
+      <w:pPr>
+        <w:pStyle w:val="NormalWeb"/>
+        <w:numPr>
+          <w:ilvl w:val="0"/>
+          <w:numId w:val="22"/>
+        </w:numPr>
+      </w:pPr>
+      <w:r>
+        <w:rPr>
+          <w:rStyle w:val="HTMLCode"/>
+          <w:rFonts w:ascii="Times New Roman" w:hAnsi="Times New Roman" w:cs="Times New Roman"/>
+        </w:rPr>
+        <w:t>COUNT(*)</w:t>
+      </w:r>
+    </w:p>
+    <w:p>
+      <w:pPr>
+        <w:pStyle w:val="NormalWeb"/>
+        <w:numPr>
+          <w:ilvl w:val="0"/>
+          <w:numId w:val="22"/>
+        </w:numPr>
+      </w:pPr>
+      <w:r>
+        <w:rPr>
+          <w:rStyle w:val="HTMLCode"/>
+          <w:rFonts w:ascii="Times New Roman" w:hAnsi="Times New Roman" w:cs="Times New Roman"/>
+        </w:rPr>
+        <w:t>ORDER BY DESC</w:t>
+      </w:r>
+      <w:r>
+        <w:t xml:space="preserve"> for ranking</w:t>
+      </w:r>
+    </w:p>
+    <w:p>
+      <w:pPr>
+        <w:pStyle w:val="NormalWeb"/>
+      </w:pPr>
+      <w:r>
+        <w:rPr>
+          <w:rStyle w:val="Strong"/>
+        </w:rPr>
+        <w:t xml:space="preserve">Business </w:t>
+      </w:r>
+      <w:r>
+        <w:rPr>
+          <w:rStyle w:val="Strong"/>
+        </w:rPr>
+        <w:t>purpose</w:t>
+      </w:r>
+      <w:r>
+        <w:rPr>
+          <w:rStyle w:val="Strong"/>
+        </w:rPr>
+        <w:t>:</w:t>
+      </w:r>
+      <w:r>
+        <w:rPr>
+          <w:rStyle w:val="Strong"/>
+        </w:rPr>
+        <w:t xml:space="preserve"> </w:t>
+      </w:r>
+      <w:r>
+        <w:t>Helps identify high-demand clinics and prioritize blood distribution.</w:t>
+      </w:r>
+    </w:p>
+    <w:p>
+      <w:pPr>
+        <w:pStyle w:val="Heading2"/>
+        <w:rPr>
+          <w:rFonts w:cs="Times New Roman"/>
+        </w:rPr>
+      </w:pPr>
+      <w:r>
+        <w:rPr>
+          <w:rFonts w:cs="Times New Roman"/>
+        </w:rPr>
+        <w:t xml:space="preserve">3. </w:t>
+      </w:r>
+      <w:r>
+        <w:rPr>
+          <w:rFonts w:cs="Times New Roman"/>
+        </w:rPr>
+        <w:t>Donation statistics per blood type</w:t>
+      </w:r>
+    </w:p>
+    <w:p>
+      <w:pPr>
+        <w:pStyle w:val="NormalWeb"/>
+      </w:pPr>
+      <w:r>
+        <w:rPr>
+          <w:rStyle w:val="Strong"/>
+        </w:rPr>
+        <w:t>Type:</w:t>
+      </w:r>
+      <w:r>
+        <w:t xml:space="preserve"> Analytical Query</w:t>
+      </w:r>
+    </w:p>
+    <w:p>
+      <w:pPr>
+        <w:pStyle w:val="NormalWeb"/>
+      </w:pPr>
+      <w:r>
+        <w:t>This query provides:</w:t>
+      </w:r>
+    </w:p>
+    <w:p>
+      <w:pPr>
+        <w:pStyle w:val="NormalWeb"/>
+        <w:numPr>
+          <w:ilvl w:val="0"/>
+          <w:numId w:val="23"/>
+        </w:numPr>
+      </w:pPr>
+      <w:r>
+        <w:t>Total number of donations per blood type</w:t>
+      </w:r>
+    </w:p>
+    <w:p>
+      <w:pPr>
+        <w:pStyle w:val="NormalWeb"/>
+        <w:numPr>
+          <w:ilvl w:val="0"/>
+          <w:numId w:val="23"/>
+        </w:numPr>
+      </w:pPr>
+      <w:r>
+        <w:t>Total donated volume</w:t>
+      </w:r>
+    </w:p>
+    <w:p>
+      <w:pPr>
+        <w:pStyle w:val="NormalWeb"/>
+        <w:numPr>
+          <w:ilvl w:val="0"/>
+          <w:numId w:val="23"/>
+        </w:numPr>
+      </w:pPr>
+      <w:r>
+        <w:t>Average donation volume</w:t>
+      </w:r>
+    </w:p>
+    <w:p>
+      <w:pPr>
+        <w:pStyle w:val="NormalWeb"/>
+      </w:pPr>
+      <w:r>
+        <w:t xml:space="preserve">It joins </w:t>
+      </w:r>
+      <w:r>
+        <w:rPr>
+          <w:rStyle w:val="HTMLCode"/>
+          <w:rFonts w:ascii="Times New Roman" w:hAnsi="Times New Roman" w:cs="Times New Roman"/>
+        </w:rPr>
+        <w:t>donor</w:t>
+      </w:r>
+      <w:r>
+        <w:t xml:space="preserve"> and </w:t>
+      </w:r>
+      <w:r>
+        <w:rPr>
+          <w:rStyle w:val="HTMLCode"/>
+          <w:rFonts w:ascii="Times New Roman" w:hAnsi="Times New Roman" w:cs="Times New Roman"/>
+        </w:rPr>
+        <w:t>donation</w:t>
+      </w:r>
+      <w:r>
+        <w:t>, and uses aggregation functions:</w:t>
+      </w:r>
+    </w:p>
+    <w:p>
+      <w:pPr>
+        <w:pStyle w:val="NormalWeb"/>
+        <w:numPr>
+          <w:ilvl w:val="0"/>
+          <w:numId w:val="24"/>
+        </w:numPr>
+      </w:pPr>
+      <w:r>
+        <w:rPr>
+          <w:rStyle w:val="HTMLCode"/>
+          <w:rFonts w:ascii="Times New Roman" w:hAnsi="Times New Roman" w:cs="Times New Roman"/>
+        </w:rPr>
+        <w:t>COUNT</w:t>
+      </w:r>
+    </w:p>
+    <w:p>
+      <w:pPr>
+        <w:pStyle w:val="NormalWeb"/>
+        <w:numPr>
+          <w:ilvl w:val="0"/>
+          <w:numId w:val="24"/>
+        </w:numPr>
+      </w:pPr>
+      <w:r>
+        <w:rPr>
+          <w:rStyle w:val="HTMLCode"/>
+          <w:rFonts w:ascii="Times New Roman" w:hAnsi="Times New Roman" w:cs="Times New Roman"/>
+        </w:rPr>
+        <w:t>SUM</w:t>
+      </w:r>
+    </w:p>
+    <w:p>
+      <w:pPr>
+        <w:pStyle w:val="NormalWeb"/>
+        <w:numPr>
+          <w:ilvl w:val="0"/>
+          <w:numId w:val="24"/>
+        </w:numPr>
+      </w:pPr>
+      <w:r>
+        <w:rPr>
+          <w:rStyle w:val="HTMLCode"/>
+          <w:rFonts w:ascii="Times New Roman" w:hAnsi="Times New Roman" w:cs="Times New Roman"/>
+        </w:rPr>
+        <w:t>AVG</w:t>
+      </w:r>
+    </w:p>
+    <w:p>
+      <w:pPr>
+        <w:pStyle w:val="NormalWeb"/>
+        <w:numPr>
+          <w:ilvl w:val="0"/>
+          <w:numId w:val="24"/>
+        </w:numPr>
+      </w:pPr>
+      <w:r>
+        <w:rPr>
+          <w:rStyle w:val="HTMLCode"/>
+          <w:rFonts w:ascii="Times New Roman" w:hAnsi="Times New Roman" w:cs="Times New Roman"/>
+        </w:rPr>
+        <w:t>GROUP BY</w:t>
+      </w:r>
+    </w:p>
+    <w:p>
+      <w:pPr>
+        <w:pStyle w:val="NormalWeb"/>
+      </w:pPr>
+      <w:r>
+        <w:rPr>
+          <w:rStyle w:val="Strong"/>
+        </w:rPr>
+        <w:t xml:space="preserve">Business </w:t>
+      </w:r>
+      <w:r>
+        <w:rPr>
+          <w:rStyle w:val="Strong"/>
+        </w:rPr>
+        <w:t>purpose</w:t>
+      </w:r>
+      <w:r>
+        <w:rPr>
+          <w:rStyle w:val="Strong"/>
+        </w:rPr>
+        <w:t>:</w:t>
+      </w:r>
+      <w:r>
+        <w:rPr>
+          <w:rStyle w:val="Strong"/>
+        </w:rPr>
+        <w:t xml:space="preserve"> </w:t>
+      </w:r>
+      <w:r>
+        <w:t>Supports inventory planning and demand forecasting by blood type.</w:t>
+      </w:r>
+    </w:p>
+    <w:p>
+      <w:pPr>
+        <w:pStyle w:val="Heading2"/>
+        <w:rPr>
+          <w:rFonts w:cs="Times New Roman"/>
+        </w:rPr>
+      </w:pPr>
+      <w:r>
+        <w:rPr>
+          <w:rFonts w:cs="Times New Roman"/>
+        </w:rPr>
+        <w:t xml:space="preserve">4. </w:t>
+      </w:r>
+      <w:r>
+        <w:rPr>
+          <w:rFonts w:cs="Times New Roman"/>
+        </w:rPr>
+        <w:t>Donors with the rarest blood type</w:t>
+      </w:r>
+    </w:p>
+    <w:p>
+      <w:pPr>
+        <w:pStyle w:val="NormalWeb"/>
+      </w:pPr>
+      <w:r>
+        <w:rPr>
+          <w:rStyle w:val="Strong"/>
+        </w:rPr>
+        <w:t>Type:</w:t>
+      </w:r>
+      <w:r>
+        <w:t xml:space="preserve"> Analytical Query (Window Function)</w:t>
+      </w:r>
+    </w:p>
+    <w:p>
+      <w:pPr>
+        <w:pStyle w:val="NormalWeb"/>
+      </w:pPr>
+      <w:r>
+        <w:t>This query:</w:t>
+      </w:r>
+    </w:p>
+    <w:p>
+      <w:pPr>
+        <w:pStyle w:val="NormalWeb"/>
+        <w:numPr>
+          <w:ilvl w:val="0"/>
+          <w:numId w:val="25"/>
+        </w:numPr>
+      </w:pPr>
+      <w:r>
+        <w:t>Counts donors per blood type</w:t>
+      </w:r>
+    </w:p>
+    <w:p>
+      <w:pPr>
+        <w:pStyle w:val="NormalWeb"/>
+        <w:numPr>
+          <w:ilvl w:val="0"/>
+          <w:numId w:val="25"/>
+        </w:numPr>
+      </w:pPr>
+      <w:r>
+        <w:t xml:space="preserve">Ranks blood types by rarity using </w:t>
+      </w:r>
+      <w:r>
+        <w:rPr>
+          <w:rStyle w:val="HTMLCode"/>
+          <w:rFonts w:ascii="Times New Roman" w:hAnsi="Times New Roman" w:cs="Times New Roman"/>
+        </w:rPr>
+        <w:t>RANK() OVER</w:t>
+      </w:r>
+    </w:p>
+    <w:p>
+      <w:pPr>
+        <w:pStyle w:val="NormalWeb"/>
+        <w:numPr>
+          <w:ilvl w:val="0"/>
+          <w:numId w:val="25"/>
+        </w:numPr>
+      </w:pPr>
+      <w:r>
+        <w:t>Selects donors belonging to the rarest blood group</w:t>
+      </w:r>
+    </w:p>
+    <w:p>
+      <w:pPr>
+        <w:pStyle w:val="NormalWeb"/>
+      </w:pPr>
+      <w:r>
+        <w:lastRenderedPageBreak/>
+        <w:t>It demonstrates use of:</w:t>
+      </w:r>
+    </w:p>
+    <w:p>
+      <w:pPr>
+        <w:pStyle w:val="NormalWeb"/>
+        <w:numPr>
+          <w:ilvl w:val="0"/>
+          <w:numId w:val="26"/>
+        </w:numPr>
+      </w:pPr>
+      <w:r>
+        <w:t>CTEs</w:t>
+      </w:r>
+    </w:p>
+    <w:p>
+      <w:pPr>
+        <w:pStyle w:val="NormalWeb"/>
+        <w:numPr>
+          <w:ilvl w:val="0"/>
+          <w:numId w:val="26"/>
+        </w:numPr>
+      </w:pPr>
+      <w:r>
+        <w:t>Window function (</w:t>
+      </w:r>
+      <w:r>
+        <w:rPr>
+          <w:rStyle w:val="HTMLCode"/>
+          <w:rFonts w:ascii="Times New Roman" w:hAnsi="Times New Roman" w:cs="Times New Roman"/>
+        </w:rPr>
+        <w:t>RANK()</w:t>
+      </w:r>
+      <w:r>
+        <w:t>)</w:t>
+      </w:r>
+    </w:p>
+    <w:p>
+      <w:pPr>
+        <w:pStyle w:val="NormalWeb"/>
+      </w:pPr>
+      <w:r>
+        <w:rPr>
+          <w:rStyle w:val="Strong"/>
+        </w:rPr>
+        <w:t xml:space="preserve">Business </w:t>
+      </w:r>
+      <w:r>
+        <w:rPr>
+          <w:rStyle w:val="Strong"/>
+        </w:rPr>
+        <w:t>purpose</w:t>
+      </w:r>
+      <w:r>
+        <w:rPr>
+          <w:rStyle w:val="Strong"/>
+        </w:rPr>
+        <w:t>:</w:t>
+      </w:r>
+      <w:r>
+        <w:rPr>
+          <w:rStyle w:val="Strong"/>
+        </w:rPr>
+        <w:t xml:space="preserve"> </w:t>
+      </w:r>
+      <w:r>
+        <w:t>Identifies critical donors for emergency planning and rare blood type management.</w:t>
+      </w:r>
+    </w:p>
+    <w:p>
+      <w:pPr>
+        <w:pStyle w:val="Heading2"/>
+        <w:rPr>
+          <w:rFonts w:cs="Times New Roman"/>
+        </w:rPr>
+      </w:pPr>
+      <w:r>
+        <w:rPr>
+          <w:rFonts w:cs="Times New Roman"/>
+        </w:rPr>
+        <w:t xml:space="preserve">5. </w:t>
+      </w:r>
+      <w:r>
+        <w:rPr>
+          <w:rFonts w:cs="Times New Roman"/>
+        </w:rPr>
+        <w:t>Matching requests to donations &amp; identifying unfulfilled requests</w:t>
+      </w:r>
+    </w:p>
+    <w:p>
+      <w:pPr>
+        <w:pStyle w:val="NormalWeb"/>
+      </w:pPr>
+      <w:r>
+        <w:rPr>
+          <w:rStyle w:val="Strong"/>
+        </w:rPr>
+        <w:t>Type:</w:t>
+      </w:r>
+      <w:r>
+        <w:t xml:space="preserve"> Operational Query</w:t>
+      </w:r>
+    </w:p>
+    <w:p>
+      <w:pPr>
+        <w:pStyle w:val="NormalWeb"/>
+      </w:pPr>
+      <w:r>
+        <w:t>This query:</w:t>
+      </w:r>
+    </w:p>
+    <w:p>
+      <w:pPr>
+        <w:pStyle w:val="NormalWeb"/>
+        <w:numPr>
+          <w:ilvl w:val="0"/>
+          <w:numId w:val="27"/>
+        </w:numPr>
+      </w:pPr>
+      <w:r>
+        <w:t xml:space="preserve">Joins </w:t>
+      </w:r>
+      <w:r>
+        <w:rPr>
+          <w:rStyle w:val="HTMLCode"/>
+          <w:rFonts w:ascii="Times New Roman" w:hAnsi="Times New Roman" w:cs="Times New Roman"/>
+        </w:rPr>
+        <w:t>blood_request</w:t>
+      </w:r>
+      <w:r>
+        <w:t xml:space="preserve">, </w:t>
+      </w:r>
+      <w:r>
+        <w:rPr>
+          <w:rStyle w:val="HTMLCode"/>
+          <w:rFonts w:ascii="Times New Roman" w:hAnsi="Times New Roman" w:cs="Times New Roman"/>
+        </w:rPr>
+        <w:t>donation</w:t>
+      </w:r>
+      <w:r>
+        <w:t xml:space="preserve">, </w:t>
+      </w:r>
+      <w:r>
+        <w:rPr>
+          <w:rStyle w:val="HTMLCode"/>
+          <w:rFonts w:ascii="Times New Roman" w:hAnsi="Times New Roman" w:cs="Times New Roman"/>
+        </w:rPr>
+        <w:t>donor</w:t>
+      </w:r>
+      <w:r>
+        <w:t xml:space="preserve">, and </w:t>
+      </w:r>
+      <w:r>
+        <w:rPr>
+          <w:rStyle w:val="HTMLCode"/>
+          <w:rFonts w:ascii="Times New Roman" w:hAnsi="Times New Roman" w:cs="Times New Roman"/>
+        </w:rPr>
+        <w:t>blood_recipient_clinic</w:t>
+      </w:r>
+    </w:p>
+    <w:p>
+      <w:pPr>
+        <w:pStyle w:val="NormalWeb"/>
+        <w:numPr>
+          <w:ilvl w:val="0"/>
+          <w:numId w:val="27"/>
+        </w:numPr>
+      </w:pPr>
+      <w:r>
+        <w:t xml:space="preserve">Uses </w:t>
+      </w:r>
+      <w:r>
+        <w:rPr>
+          <w:rStyle w:val="HTMLCode"/>
+          <w:rFonts w:ascii="Times New Roman" w:hAnsi="Times New Roman" w:cs="Times New Roman"/>
+        </w:rPr>
+        <w:t>LEFT JOIN</w:t>
+      </w:r>
+      <w:r>
+        <w:t xml:space="preserve"> to detect unfulfilled requests</w:t>
+      </w:r>
+    </w:p>
+    <w:p>
+      <w:pPr>
+        <w:pStyle w:val="NormalWeb"/>
+        <w:numPr>
+          <w:ilvl w:val="0"/>
+          <w:numId w:val="27"/>
+        </w:numPr>
+      </w:pPr>
+      <w:r>
+        <w:t>Filters requests with no linked donation</w:t>
+      </w:r>
+    </w:p>
+    <w:p>
+      <w:pPr>
+        <w:pStyle w:val="NormalWeb"/>
+      </w:pPr>
+      <w:r>
+        <w:rPr>
+          <w:rStyle w:val="Strong"/>
+        </w:rPr>
+        <w:t xml:space="preserve">Business </w:t>
+      </w:r>
+      <w:r>
+        <w:rPr>
+          <w:rStyle w:val="Strong"/>
+        </w:rPr>
+        <w:t>purpose</w:t>
+      </w:r>
+      <w:r>
+        <w:rPr>
+          <w:rStyle w:val="Strong"/>
+        </w:rPr>
+        <w:t>:</w:t>
+      </w:r>
+      <w:r>
+        <w:rPr>
+          <w:rStyle w:val="Strong"/>
+        </w:rPr>
+        <w:t xml:space="preserve"> </w:t>
+      </w:r>
+      <w:r>
+        <w:t>Allows the system to:</w:t>
+      </w:r>
+    </w:p>
+    <w:p>
+      <w:pPr>
+        <w:pStyle w:val="NormalWeb"/>
+        <w:numPr>
+          <w:ilvl w:val="0"/>
+          <w:numId w:val="28"/>
+        </w:numPr>
+      </w:pPr>
+      <w:r>
+        <w:t>Track open/unfulfilled blood requests</w:t>
+      </w:r>
+    </w:p>
+    <w:p>
+      <w:pPr>
+        <w:pStyle w:val="NormalWeb"/>
+        <w:numPr>
+          <w:ilvl w:val="0"/>
+          <w:numId w:val="28"/>
+        </w:numPr>
+      </w:pPr>
+      <w:r>
+        <w:t>Monitor operational efficiency</w:t>
+      </w:r>
+    </w:p>
+    <w:p>
+      <w:pPr>
+        <w:pStyle w:val="NormalWeb"/>
+        <w:numPr>
+          <w:ilvl w:val="0"/>
+          <w:numId w:val="28"/>
+        </w:numPr>
+      </w:pPr>
+      <w:r>
+        <w:t>Support resource allocation decisions</w:t>
+      </w:r>
+    </w:p>
+    <w:p>
+      <w:pPr>
+        <w:pStyle w:val="Heading2"/>
+        <w:rPr>
+          <w:rFonts w:cs="Times New Roman"/>
+        </w:rPr>
+      </w:pPr>
+      <w:r>
+        <w:rPr>
+          <w:rFonts w:cs="Times New Roman"/>
+        </w:rPr>
+        <w:t xml:space="preserve">6. </w:t>
+      </w:r>
+      <w:r>
+        <w:rPr>
+          <w:rFonts w:cs="Times New Roman"/>
+        </w:rPr>
+        <w:t>Donors eligible to donate again</w:t>
+      </w:r>
+    </w:p>
+    <w:p>
+      <w:pPr>
+        <w:pStyle w:val="NormalWeb"/>
+      </w:pPr>
+      <w:r>
+        <w:rPr>
+          <w:rStyle w:val="Strong"/>
+        </w:rPr>
+        <w:t>Type:</w:t>
+      </w:r>
+      <w:r>
+        <w:t xml:space="preserve"> Operational + Analytical (CTE)</w:t>
+      </w:r>
+    </w:p>
+    <w:p>
+      <w:pPr>
+        <w:pStyle w:val="NormalWeb"/>
+      </w:pPr>
+      <w:r>
+        <w:t>This query:</w:t>
+      </w:r>
+    </w:p>
+    <w:p>
+      <w:pPr>
+        <w:pStyle w:val="NormalWeb"/>
+        <w:numPr>
+          <w:ilvl w:val="0"/>
+          <w:numId w:val="29"/>
+        </w:numPr>
+      </w:pPr>
+      <w:r>
+        <w:t>Computes each donor’s last donation date</w:t>
+      </w:r>
+    </w:p>
+    <w:p>
+      <w:pPr>
+        <w:pStyle w:val="NormalWeb"/>
+        <w:numPr>
+          <w:ilvl w:val="0"/>
+          <w:numId w:val="29"/>
+        </w:numPr>
+      </w:pPr>
+      <w:r>
+        <w:t>Applies a business rule (&gt;= 56 days since last donation)</w:t>
+      </w:r>
+    </w:p>
+    <w:p>
+      <w:pPr>
+        <w:pStyle w:val="NormalWeb"/>
+        <w:numPr>
+          <w:ilvl w:val="0"/>
+          <w:numId w:val="29"/>
+        </w:numPr>
+      </w:pPr>
+      <w:r>
+        <w:t>Filters donors who are medically eligible</w:t>
+      </w:r>
+    </w:p>
+    <w:p>
+      <w:pPr>
+        <w:pStyle w:val="NormalWeb"/>
+      </w:pPr>
+      <w:r>
+        <w:t>It uses:</w:t>
+      </w:r>
+    </w:p>
+    <w:p>
+      <w:pPr>
+        <w:pStyle w:val="NormalWeb"/>
+        <w:numPr>
+          <w:ilvl w:val="0"/>
+          <w:numId w:val="30"/>
+        </w:numPr>
+      </w:pPr>
+      <w:r>
+        <w:t>CTE (</w:t>
+      </w:r>
+      <w:r>
+        <w:rPr>
+          <w:rStyle w:val="HTMLCode"/>
+          <w:rFonts w:ascii="Times New Roman" w:hAnsi="Times New Roman" w:cs="Times New Roman"/>
+        </w:rPr>
+        <w:t>WITH last_donation AS</w:t>
+      </w:r>
+      <w:r>
+        <w:t>)</w:t>
+      </w:r>
+    </w:p>
+    <w:p>
+      <w:pPr>
+        <w:pStyle w:val="NormalWeb"/>
+        <w:numPr>
+          <w:ilvl w:val="0"/>
+          <w:numId w:val="30"/>
+        </w:numPr>
+      </w:pPr>
+      <w:r>
+        <w:rPr>
+          <w:rStyle w:val="HTMLCode"/>
+          <w:rFonts w:ascii="Times New Roman" w:hAnsi="Times New Roman" w:cs="Times New Roman"/>
+        </w:rPr>
+        <w:t>MAX()</w:t>
+      </w:r>
+      <w:r>
+        <w:t xml:space="preserve"> aggregation</w:t>
+      </w:r>
+    </w:p>
+    <w:p>
+      <w:pPr>
+        <w:pStyle w:val="NormalWeb"/>
+        <w:numPr>
+          <w:ilvl w:val="0"/>
+          <w:numId w:val="30"/>
+        </w:numPr>
+      </w:pPr>
+      <w:r>
+        <w:t>Date comparison logic</w:t>
+      </w:r>
+    </w:p>
+    <w:p>
+      <w:pPr>
+        <w:pStyle w:val="NormalWeb"/>
+      </w:pPr>
+      <w:r>
+        <w:rPr>
+          <w:rStyle w:val="Strong"/>
+        </w:rPr>
+        <w:t xml:space="preserve">Business </w:t>
+      </w:r>
+      <w:r>
+        <w:rPr>
+          <w:rStyle w:val="Strong"/>
+        </w:rPr>
+        <w:t>purpose</w:t>
+      </w:r>
+      <w:r>
+        <w:rPr>
+          <w:rStyle w:val="Strong"/>
+        </w:rPr>
+        <w:t>:</w:t>
+      </w:r>
+      <w:r>
+        <w:rPr>
+          <w:rStyle w:val="Strong"/>
+        </w:rPr>
+        <w:t xml:space="preserve"> </w:t>
+      </w:r>
+      <w:r>
+        <w:t>Supports donor scheduling and eligibility tracking based on medical standards.</w:t>
+      </w:r>
+    </w:p>
+    <w:p>
+      <w:pPr>
+        <w:pStyle w:val="Heading2"/>
+        <w:rPr>
+          <w:rFonts w:cs="Times New Roman"/>
+        </w:rPr>
+      </w:pPr>
+      <w:r>
+        <w:rPr>
+          <w:rFonts w:cs="Times New Roman"/>
+        </w:rPr>
+        <w:lastRenderedPageBreak/>
+        <w:t>7. Full Delivery Trace (Multi-table Join)</w:t>
+      </w:r>
+    </w:p>
+    <w:p>
+      <w:pPr>
+        <w:pStyle w:val="NormalWeb"/>
+      </w:pPr>
+      <w:r>
+        <w:rPr>
+          <w:rStyle w:val="Strong"/>
+        </w:rPr>
+        <w:t>Type:</w:t>
+      </w:r>
+      <w:r>
+        <w:t xml:space="preserve"> Analytical (Complex Join Across 6+ Tables)</w:t>
+      </w:r>
+    </w:p>
+    <w:p>
+      <w:pPr>
+        <w:pStyle w:val="NormalWeb"/>
+      </w:pPr>
+      <w:r>
+        <w:t>This query connects:</w:t>
+      </w:r>
+    </w:p>
+    <w:p>
+      <w:pPr>
+        <w:pStyle w:val="NormalWeb"/>
+        <w:numPr>
+          <w:ilvl w:val="0"/>
+          <w:numId w:val="31"/>
+        </w:numPr>
+      </w:pPr>
+      <w:r>
+        <w:rPr>
+          <w:rStyle w:val="HTMLCode"/>
+          <w:rFonts w:ascii="Times New Roman" w:hAnsi="Times New Roman" w:cs="Times New Roman"/>
+        </w:rPr>
+        <w:t>delivery</w:t>
+      </w:r>
+    </w:p>
+    <w:p>
+      <w:pPr>
+        <w:pStyle w:val="NormalWeb"/>
+        <w:numPr>
+          <w:ilvl w:val="0"/>
+          <w:numId w:val="31"/>
+        </w:numPr>
+      </w:pPr>
+      <w:r>
+        <w:rPr>
+          <w:rStyle w:val="HTMLCode"/>
+          <w:rFonts w:ascii="Times New Roman" w:hAnsi="Times New Roman" w:cs="Times New Roman"/>
+        </w:rPr>
+        <w:t>donation</w:t>
+      </w:r>
+    </w:p>
+    <w:p>
+      <w:pPr>
+        <w:pStyle w:val="NormalWeb"/>
+        <w:numPr>
+          <w:ilvl w:val="0"/>
+          <w:numId w:val="31"/>
+        </w:numPr>
+      </w:pPr>
+      <w:r>
+        <w:rPr>
+          <w:rStyle w:val="HTMLCode"/>
+          <w:rFonts w:ascii="Times New Roman" w:hAnsi="Times New Roman" w:cs="Times New Roman"/>
+        </w:rPr>
+        <w:t>donor</w:t>
+      </w:r>
+    </w:p>
+    <w:p>
+      <w:pPr>
+        <w:pStyle w:val="NormalWeb"/>
+        <w:numPr>
+          <w:ilvl w:val="0"/>
+          <w:numId w:val="31"/>
+        </w:numPr>
+      </w:pPr>
+      <w:r>
+        <w:rPr>
+          <w:rStyle w:val="HTMLCode"/>
+          <w:rFonts w:ascii="Times New Roman" w:hAnsi="Times New Roman" w:cs="Times New Roman"/>
+        </w:rPr>
+        <w:t>doctor</w:t>
+      </w:r>
+    </w:p>
+    <w:p>
+      <w:pPr>
+        <w:pStyle w:val="NormalWeb"/>
+        <w:numPr>
+          <w:ilvl w:val="0"/>
+          <w:numId w:val="31"/>
+        </w:numPr>
+      </w:pPr>
+      <w:r>
+        <w:rPr>
+          <w:rStyle w:val="HTMLCode"/>
+          <w:rFonts w:ascii="Times New Roman" w:hAnsi="Times New Roman" w:cs="Times New Roman"/>
+        </w:rPr>
+        <w:t>clinic</w:t>
+      </w:r>
+    </w:p>
+    <w:p>
+      <w:pPr>
+        <w:pStyle w:val="NormalWeb"/>
+        <w:numPr>
+          <w:ilvl w:val="0"/>
+          <w:numId w:val="31"/>
+        </w:numPr>
+      </w:pPr>
+      <w:r>
+        <w:rPr>
+          <w:rStyle w:val="HTMLCode"/>
+          <w:rFonts w:ascii="Times New Roman" w:hAnsi="Times New Roman" w:cs="Times New Roman"/>
+        </w:rPr>
+        <w:t>blood_recipient_clinic</w:t>
+      </w:r>
+    </w:p>
+    <w:p>
+      <w:pPr>
+        <w:pStyle w:val="NormalWeb"/>
+        <w:numPr>
+          <w:ilvl w:val="0"/>
+          <w:numId w:val="31"/>
+        </w:numPr>
+      </w:pPr>
+      <w:r>
+        <w:rPr>
+          <w:rStyle w:val="HTMLCode"/>
+          <w:rFonts w:ascii="Times New Roman" w:hAnsi="Times New Roman" w:cs="Times New Roman"/>
+        </w:rPr>
+        <w:t>zip</w:t>
+      </w:r>
+    </w:p>
+    <w:p>
+      <w:pPr>
+        <w:pStyle w:val="NormalWeb"/>
+      </w:pPr>
+      <w:r>
+        <w:t>It provides a full trace from donor to final recipient.</w:t>
+      </w:r>
+    </w:p>
+    <w:p>
+      <w:pPr>
+        <w:autoSpaceDE w:val="0"/>
+        <w:autoSpaceDN w:val="0"/>
+        <w:adjustRightInd w:val="0"/>
+        <w:spacing w:line="240" w:lineRule="auto"/>
+        <w:ind w:firstLine="0"/>
+      </w:pPr>
+    </w:p>
     <w:sectPr>
-      <w:headerReference w:type="even" r:id="rId9"/>
-      <w:headerReference w:type="default" r:id="rId10"/>
-      <w:headerReference w:type="first" r:id="rId11"/>
+      <w:headerReference w:type="even" r:id="rId15"/>
+      <w:headerReference w:type="default" r:id="rId16"/>
+      <w:headerReference w:type="first" r:id="rId17"/>
       <w:pgSz w:w="12240" w:h="15840" w:code="1"/>
       <w:pgMar w:top="1440" w:right="1440" w:bottom="1440" w:left="1440" w:header="720" w:footer="720" w:gutter="0"/>
       <w:cols w:space="720"/>
@@ -931,6 +2604,155 @@
 <file path=word/numbering.xml><?xml version="1.0" encoding="utf-8"?>
 <w:numbering xmlns:wpc="http://schemas.microsoft.com/office/word/2010/wordprocessingCanvas" xmlns:cx="http://schemas.microsoft.com/office/drawing/2014/chartex" xmlns:cx1="http://schemas.microsoft.com/office/drawing/2015/9/8/chartex" xmlns:cx2="http://schemas.microsoft.com/office/drawing/2015/10/21/chartex" xmlns:cx3="http://schemas.microsoft.com/office/drawing/2016/5/9/chartex" xmlns:cx4="http://schemas.microsoft.com/office/drawing/2016/5/10/chartex" xmlns:cx5="http://schemas.microsoft.com/office/drawing/2016/5/11/chartex" xmlns:cx6="http://schemas.microsoft.com/office/drawing/2016/5/12/chartex" xmlns:cx7="http://schemas.microsoft.com/office/drawing/2016/5/13/chartex" xmlns:cx8="http://schemas.microsoft.com/office/drawing/2016/5/14/chartex" xmlns:mc="http://schemas.openxmlformats.org/markup-compatibility/2006" xmlns:aink="http://schemas.microsoft.com/office/drawing/2016/ink" xmlns:am3d="http://schemas.microsoft.com/office/drawing/2017/model3d" xmlns:o="urn:schemas-microsoft-com:office:office" xmlns:oel="http://schemas.microsoft.com/office/2019/extlst" xmlns:r="http://schemas.openxmlformats.org/officeDocument/2006/relationships" xmlns:m="http://schemas.openxmlformats.org/officeDocument/2006/math" xmlns:v="urn:schemas-microsoft-com:vml" xmlns:wp14="http://schemas.microsoft.com/office/word/2010/wordprocessingDrawing" xmlns:wp="http://schemas.openxmlformats.org/drawingml/2006/wordprocessingDrawing" xmlns:w10="urn:schemas-microsoft-com:office:word" xmlns:w="http://schemas.openxmlformats.org/wordprocessingml/2006/main" xmlns:w14="http://schemas.microsoft.com/office/word/2010/wordml" xmlns:w15="http://schemas.microsoft.com/office/word/2012/wordml" xmlns:w16cex="http://schemas.microsoft.com/office/word/2018/wordml/cex" xmlns:w16cid="http://schemas.microsoft.com/office/word/2016/wordml/cid" xmlns:w16="http://schemas.microsoft.com/office/word/2018/wordml" xmlns:w16du="http://schemas.microsoft.com/office/word/2023/wordml/word16du" xmlns:w16sdtdh="http://schemas.microsoft.com/office/word/2020/wordml/sdtdatahash" xmlns:w16sdtfl="http://schemas.microsoft.com/office/word/2024/wordml/sdtformatlock" xmlns:w16se="http://schemas.microsoft.com/office/word/2015/wordml/symex" xmlns:wpg="http://schemas.microsoft.com/office/word/2010/wordprocessingGroup" xmlns:wpi="http://schemas.microsoft.com/office/word/2010/wordprocessingInk" xmlns:wne="http://schemas.microsoft.com/office/word/2006/wordml" xmlns:wps="http://schemas.microsoft.com/office/word/2010/wordprocessingShape" mc:Ignorable="w14 w15 w16se w16cid w16 w16cex w16sdtdh w16sdtfl w16du wp14">
   <w:abstractNum w:abstractNumId="0" w15:restartNumberingAfterBreak="0">
+    <w:nsid w:val="0224525B"/>
+    <w:multiLevelType w:val="multilevel"/>
+    <w:tmpl w:val="5E08DAE8"/>
+    <w:lvl w:ilvl="0">
+      <w:start w:val="1"/>
+      <w:numFmt w:val="bullet"/>
+      <w:lvlText w:val=""/>
+      <w:lvlJc w:val="left"/>
+      <w:pPr>
+        <w:tabs>
+          <w:tab w:val="num" w:pos="720"/>
+        </w:tabs>
+        <w:ind w:left="720" w:hanging="360"/>
+      </w:pPr>
+      <w:rPr>
+        <w:rFonts w:ascii="Symbol" w:hAnsi="Symbol" w:hint="default"/>
+        <w:sz w:val="20"/>
+      </w:rPr>
+    </w:lvl>
+    <w:lvl w:ilvl="1" w:tentative="1">
+      <w:start w:val="1"/>
+      <w:numFmt w:val="bullet"/>
+      <w:lvlText w:val="o"/>
+      <w:lvlJc w:val="left"/>
+      <w:pPr>
+        <w:tabs>
+          <w:tab w:val="num" w:pos="1440"/>
+        </w:tabs>
+        <w:ind w:left="1440" w:hanging="360"/>
+      </w:pPr>
+      <w:rPr>
+        <w:rFonts w:ascii="Courier New" w:hAnsi="Courier New" w:hint="default"/>
+        <w:sz w:val="20"/>
+      </w:rPr>
+    </w:lvl>
+    <w:lvl w:ilvl="2" w:tentative="1">
+      <w:start w:val="1"/>
+      <w:numFmt w:val="bullet"/>
+      <w:lvlText w:val=""/>
+      <w:lvlJc w:val="left"/>
+      <w:pPr>
+        <w:tabs>
+          <w:tab w:val="num" w:pos="2160"/>
+        </w:tabs>
+        <w:ind w:left="2160" w:hanging="360"/>
+      </w:pPr>
+      <w:rPr>
+        <w:rFonts w:ascii="Wingdings" w:hAnsi="Wingdings" w:hint="default"/>
+        <w:sz w:val="20"/>
+      </w:rPr>
+    </w:lvl>
+    <w:lvl w:ilvl="3" w:tentative="1">
+      <w:start w:val="1"/>
+      <w:numFmt w:val="bullet"/>
+      <w:lvlText w:val=""/>
+      <w:lvlJc w:val="left"/>
+      <w:pPr>
+        <w:tabs>
+          <w:tab w:val="num" w:pos="2880"/>
+        </w:tabs>
+        <w:ind w:left="2880" w:hanging="360"/>
+      </w:pPr>
+      <w:rPr>
+        <w:rFonts w:ascii="Wingdings" w:hAnsi="Wingdings" w:hint="default"/>
+        <w:sz w:val="20"/>
+      </w:rPr>
+    </w:lvl>
+    <w:lvl w:ilvl="4" w:tentative="1">
+      <w:start w:val="1"/>
+      <w:numFmt w:val="bullet"/>
+      <w:lvlText w:val=""/>
+      <w:lvlJc w:val="left"/>
+      <w:pPr>
+        <w:tabs>
+          <w:tab w:val="num" w:pos="3600"/>
+        </w:tabs>
+        <w:ind w:left="3600" w:hanging="360"/>
+      </w:pPr>
+      <w:rPr>
+        <w:rFonts w:ascii="Wingdings" w:hAnsi="Wingdings" w:hint="default"/>
+        <w:sz w:val="20"/>
+      </w:rPr>
+    </w:lvl>
+    <w:lvl w:ilvl="5" w:tentative="1">
+      <w:start w:val="1"/>
+      <w:numFmt w:val="bullet"/>
+      <w:lvlText w:val=""/>
+      <w:lvlJc w:val="left"/>
+      <w:pPr>
+        <w:tabs>
+          <w:tab w:val="num" w:pos="4320"/>
+        </w:tabs>
+        <w:ind w:left="4320" w:hanging="360"/>
+      </w:pPr>
+      <w:rPr>
+        <w:rFonts w:ascii="Wingdings" w:hAnsi="Wingdings" w:hint="default"/>
+        <w:sz w:val="20"/>
+      </w:rPr>
+    </w:lvl>
+    <w:lvl w:ilvl="6" w:tentative="1">
+      <w:start w:val="1"/>
+      <w:numFmt w:val="bullet"/>
+      <w:lvlText w:val=""/>
+      <w:lvlJc w:val="left"/>
+      <w:pPr>
+        <w:tabs>
+          <w:tab w:val="num" w:pos="5040"/>
+        </w:tabs>
+        <w:ind w:left="5040" w:hanging="360"/>
+      </w:pPr>
+      <w:rPr>
+        <w:rFonts w:ascii="Wingdings" w:hAnsi="Wingdings" w:hint="default"/>
+        <w:sz w:val="20"/>
+      </w:rPr>
+    </w:lvl>
+    <w:lvl w:ilvl="7" w:tentative="1">
+      <w:start w:val="1"/>
+      <w:numFmt w:val="bullet"/>
+      <w:lvlText w:val=""/>
+      <w:lvlJc w:val="left"/>
+      <w:pPr>
+        <w:tabs>
+          <w:tab w:val="num" w:pos="5760"/>
+        </w:tabs>
+        <w:ind w:left="5760" w:hanging="360"/>
+      </w:pPr>
+      <w:rPr>
+        <w:rFonts w:ascii="Wingdings" w:hAnsi="Wingdings" w:hint="default"/>
+        <w:sz w:val="20"/>
+      </w:rPr>
+    </w:lvl>
+    <w:lvl w:ilvl="8" w:tentative="1">
+      <w:start w:val="1"/>
+      <w:numFmt w:val="bullet"/>
+      <w:lvlText w:val=""/>
+      <w:lvlJc w:val="left"/>
+      <w:pPr>
+        <w:tabs>
+          <w:tab w:val="num" w:pos="6480"/>
+        </w:tabs>
+        <w:ind w:left="6480" w:hanging="360"/>
+      </w:pPr>
+      <w:rPr>
+        <w:rFonts w:ascii="Wingdings" w:hAnsi="Wingdings" w:hint="default"/>
+        <w:sz w:val="20"/>
+      </w:rPr>
+    </w:lvl>
+  </w:abstractNum>
+  <w:abstractNum w:abstractNumId="1" w15:restartNumberingAfterBreak="0">
     <w:nsid w:val="090663B7"/>
     <w:multiLevelType w:val="hybridMultilevel"/>
     <w:tmpl w:val="759C7088"/>
@@ -1042,7 +2864,269 @@
       </w:rPr>
     </w:lvl>
   </w:abstractNum>
-  <w:abstractNum w:abstractNumId="1" w15:restartNumberingAfterBreak="0">
+  <w:abstractNum w:abstractNumId="2" w15:restartNumberingAfterBreak="0">
+    <w:nsid w:val="13E140A1"/>
+    <w:multiLevelType w:val="multilevel"/>
+    <w:tmpl w:val="4C70F8BE"/>
+    <w:lvl w:ilvl="0">
+      <w:start w:val="1"/>
+      <w:numFmt w:val="bullet"/>
+      <w:lvlText w:val=""/>
+      <w:lvlJc w:val="left"/>
+      <w:pPr>
+        <w:tabs>
+          <w:tab w:val="num" w:pos="720"/>
+        </w:tabs>
+        <w:ind w:left="720" w:hanging="360"/>
+      </w:pPr>
+      <w:rPr>
+        <w:rFonts w:ascii="Symbol" w:hAnsi="Symbol" w:hint="default"/>
+        <w:sz w:val="20"/>
+      </w:rPr>
+    </w:lvl>
+    <w:lvl w:ilvl="1" w:tentative="1">
+      <w:start w:val="1"/>
+      <w:numFmt w:val="bullet"/>
+      <w:lvlText w:val="o"/>
+      <w:lvlJc w:val="left"/>
+      <w:pPr>
+        <w:tabs>
+          <w:tab w:val="num" w:pos="1440"/>
+        </w:tabs>
+        <w:ind w:left="1440" w:hanging="360"/>
+      </w:pPr>
+      <w:rPr>
+        <w:rFonts w:ascii="Courier New" w:hAnsi="Courier New" w:hint="default"/>
+        <w:sz w:val="20"/>
+      </w:rPr>
+    </w:lvl>
+    <w:lvl w:ilvl="2" w:tentative="1">
+      <w:start w:val="1"/>
+      <w:numFmt w:val="bullet"/>
+      <w:lvlText w:val=""/>
+      <w:lvlJc w:val="left"/>
+      <w:pPr>
+        <w:tabs>
+          <w:tab w:val="num" w:pos="2160"/>
+        </w:tabs>
+        <w:ind w:left="2160" w:hanging="360"/>
+      </w:pPr>
+      <w:rPr>
+        <w:rFonts w:ascii="Wingdings" w:hAnsi="Wingdings" w:hint="default"/>
+        <w:sz w:val="20"/>
+      </w:rPr>
+    </w:lvl>
+    <w:lvl w:ilvl="3" w:tentative="1">
+      <w:start w:val="1"/>
+      <w:numFmt w:val="bullet"/>
+      <w:lvlText w:val=""/>
+      <w:lvlJc w:val="left"/>
+      <w:pPr>
+        <w:tabs>
+          <w:tab w:val="num" w:pos="2880"/>
+        </w:tabs>
+        <w:ind w:left="2880" w:hanging="360"/>
+      </w:pPr>
+      <w:rPr>
+        <w:rFonts w:ascii="Wingdings" w:hAnsi="Wingdings" w:hint="default"/>
+        <w:sz w:val="20"/>
+      </w:rPr>
+    </w:lvl>
+    <w:lvl w:ilvl="4" w:tentative="1">
+      <w:start w:val="1"/>
+      <w:numFmt w:val="bullet"/>
+      <w:lvlText w:val=""/>
+      <w:lvlJc w:val="left"/>
+      <w:pPr>
+        <w:tabs>
+          <w:tab w:val="num" w:pos="3600"/>
+        </w:tabs>
+        <w:ind w:left="3600" w:hanging="360"/>
+      </w:pPr>
+      <w:rPr>
+        <w:rFonts w:ascii="Wingdings" w:hAnsi="Wingdings" w:hint="default"/>
+        <w:sz w:val="20"/>
+      </w:rPr>
+    </w:lvl>
+    <w:lvl w:ilvl="5" w:tentative="1">
+      <w:start w:val="1"/>
+      <w:numFmt w:val="bullet"/>
+      <w:lvlText w:val=""/>
+      <w:lvlJc w:val="left"/>
+      <w:pPr>
+        <w:tabs>
+          <w:tab w:val="num" w:pos="4320"/>
+        </w:tabs>
+        <w:ind w:left="4320" w:hanging="360"/>
+      </w:pPr>
+      <w:rPr>
+        <w:rFonts w:ascii="Wingdings" w:hAnsi="Wingdings" w:hint="default"/>
+        <w:sz w:val="20"/>
+      </w:rPr>
+    </w:lvl>
+    <w:lvl w:ilvl="6" w:tentative="1">
+      <w:start w:val="1"/>
+      <w:numFmt w:val="bullet"/>
+      <w:lvlText w:val=""/>
+      <w:lvlJc w:val="left"/>
+      <w:pPr>
+        <w:tabs>
+          <w:tab w:val="num" w:pos="5040"/>
+        </w:tabs>
+        <w:ind w:left="5040" w:hanging="360"/>
+      </w:pPr>
+      <w:rPr>
+        <w:rFonts w:ascii="Wingdings" w:hAnsi="Wingdings" w:hint="default"/>
+        <w:sz w:val="20"/>
+      </w:rPr>
+    </w:lvl>
+    <w:lvl w:ilvl="7" w:tentative="1">
+      <w:start w:val="1"/>
+      <w:numFmt w:val="bullet"/>
+      <w:lvlText w:val=""/>
+      <w:lvlJc w:val="left"/>
+      <w:pPr>
+        <w:tabs>
+          <w:tab w:val="num" w:pos="5760"/>
+        </w:tabs>
+        <w:ind w:left="5760" w:hanging="360"/>
+      </w:pPr>
+      <w:rPr>
+        <w:rFonts w:ascii="Wingdings" w:hAnsi="Wingdings" w:hint="default"/>
+        <w:sz w:val="20"/>
+      </w:rPr>
+    </w:lvl>
+    <w:lvl w:ilvl="8" w:tentative="1">
+      <w:start w:val="1"/>
+      <w:numFmt w:val="bullet"/>
+      <w:lvlText w:val=""/>
+      <w:lvlJc w:val="left"/>
+      <w:pPr>
+        <w:tabs>
+          <w:tab w:val="num" w:pos="6480"/>
+        </w:tabs>
+        <w:ind w:left="6480" w:hanging="360"/>
+      </w:pPr>
+      <w:rPr>
+        <w:rFonts w:ascii="Wingdings" w:hAnsi="Wingdings" w:hint="default"/>
+        <w:sz w:val="20"/>
+      </w:rPr>
+    </w:lvl>
+  </w:abstractNum>
+  <w:abstractNum w:abstractNumId="3" w15:restartNumberingAfterBreak="0">
+    <w:nsid w:val="1DBA2DE3"/>
+    <w:multiLevelType w:val="multilevel"/>
+    <w:tmpl w:val="37063F18"/>
+    <w:lvl w:ilvl="0">
+      <w:start w:val="1"/>
+      <w:numFmt w:val="decimal"/>
+      <w:lvlText w:val="%1."/>
+      <w:lvlJc w:val="left"/>
+      <w:pPr>
+        <w:tabs>
+          <w:tab w:val="num" w:pos="720"/>
+        </w:tabs>
+        <w:ind w:left="720" w:hanging="360"/>
+      </w:pPr>
+    </w:lvl>
+    <w:lvl w:ilvl="1" w:tentative="1">
+      <w:start w:val="1"/>
+      <w:numFmt w:val="decimal"/>
+      <w:lvlText w:val="%2."/>
+      <w:lvlJc w:val="left"/>
+      <w:pPr>
+        <w:tabs>
+          <w:tab w:val="num" w:pos="1440"/>
+        </w:tabs>
+        <w:ind w:left="1440" w:hanging="360"/>
+      </w:pPr>
+    </w:lvl>
+    <w:lvl w:ilvl="2" w:tentative="1">
+      <w:start w:val="1"/>
+      <w:numFmt w:val="decimal"/>
+      <w:lvlText w:val="%3."/>
+      <w:lvlJc w:val="left"/>
+      <w:pPr>
+        <w:tabs>
+          <w:tab w:val="num" w:pos="2160"/>
+        </w:tabs>
+        <w:ind w:left="2160" w:hanging="360"/>
+      </w:pPr>
+    </w:lvl>
+    <w:lvl w:ilvl="3" w:tentative="1">
+      <w:start w:val="1"/>
+      <w:numFmt w:val="decimal"/>
+      <w:lvlText w:val="%4."/>
+      <w:lvlJc w:val="left"/>
+      <w:pPr>
+        <w:tabs>
+          <w:tab w:val="num" w:pos="2880"/>
+        </w:tabs>
+        <w:ind w:left="2880" w:hanging="360"/>
+      </w:pPr>
+    </w:lvl>
+    <w:lvl w:ilvl="4" w:tentative="1">
+      <w:start w:val="1"/>
+      <w:numFmt w:val="decimal"/>
+      <w:lvlText w:val="%5."/>
+      <w:lvlJc w:val="left"/>
+      <w:pPr>
+        <w:tabs>
+          <w:tab w:val="num" w:pos="3600"/>
+        </w:tabs>
+        <w:ind w:left="3600" w:hanging="360"/>
+      </w:pPr>
+    </w:lvl>
+    <w:lvl w:ilvl="5" w:tentative="1">
+      <w:start w:val="1"/>
+      <w:numFmt w:val="decimal"/>
+      <w:lvlText w:val="%6."/>
+      <w:lvlJc w:val="left"/>
+      <w:pPr>
+        <w:tabs>
+          <w:tab w:val="num" w:pos="4320"/>
+        </w:tabs>
+        <w:ind w:left="4320" w:hanging="360"/>
+      </w:pPr>
+    </w:lvl>
+    <w:lvl w:ilvl="6" w:tentative="1">
+      <w:start w:val="1"/>
+      <w:numFmt w:val="decimal"/>
+      <w:lvlText w:val="%7."/>
+      <w:lvlJc w:val="left"/>
+      <w:pPr>
+        <w:tabs>
+          <w:tab w:val="num" w:pos="5040"/>
+        </w:tabs>
+        <w:ind w:left="5040" w:hanging="360"/>
+      </w:pPr>
+    </w:lvl>
+    <w:lvl w:ilvl="7" w:tentative="1">
+      <w:start w:val="1"/>
+      <w:numFmt w:val="decimal"/>
+      <w:lvlText w:val="%8."/>
+      <w:lvlJc w:val="left"/>
+      <w:pPr>
+        <w:tabs>
+          <w:tab w:val="num" w:pos="5760"/>
+        </w:tabs>
+        <w:ind w:left="5760" w:hanging="360"/>
+      </w:pPr>
+    </w:lvl>
+    <w:lvl w:ilvl="8" w:tentative="1">
+      <w:start w:val="1"/>
+      <w:numFmt w:val="decimal"/>
+      <w:lvlText w:val="%9."/>
+      <w:lvlJc w:val="left"/>
+      <w:pPr>
+        <w:tabs>
+          <w:tab w:val="num" w:pos="6480"/>
+        </w:tabs>
+        <w:ind w:left="6480" w:hanging="360"/>
+      </w:pPr>
+    </w:lvl>
+  </w:abstractNum>
+  <w:abstractNum w:abstractNumId="4" w15:restartNumberingAfterBreak="0">
     <w:nsid w:val="26CA3EC2"/>
     <w:multiLevelType w:val="hybridMultilevel"/>
     <w:tmpl w:val="92847758"/>
@@ -1128,7 +3212,7 @@
       </w:pPr>
     </w:lvl>
   </w:abstractNum>
-  <w:abstractNum w:abstractNumId="2" w15:restartNumberingAfterBreak="0">
+  <w:abstractNum w:abstractNumId="5" w15:restartNumberingAfterBreak="0">
     <w:nsid w:val="278E323A"/>
     <w:multiLevelType w:val="hybridMultilevel"/>
     <w:tmpl w:val="D81AF1DC"/>
@@ -1240,7 +3324,7 @@
       </w:rPr>
     </w:lvl>
   </w:abstractNum>
-  <w:abstractNum w:abstractNumId="3" w15:restartNumberingAfterBreak="0">
+  <w:abstractNum w:abstractNumId="6" w15:restartNumberingAfterBreak="0">
     <w:nsid w:val="2EA35F79"/>
     <w:multiLevelType w:val="hybridMultilevel"/>
     <w:tmpl w:val="E49E35D0"/>
@@ -1329,7 +3413,7 @@
       </w:pPr>
     </w:lvl>
   </w:abstractNum>
-  <w:abstractNum w:abstractNumId="4" w15:restartNumberingAfterBreak="0">
+  <w:abstractNum w:abstractNumId="7" w15:restartNumberingAfterBreak="0">
     <w:nsid w:val="310545A4"/>
     <w:multiLevelType w:val="hybridMultilevel"/>
     <w:tmpl w:val="4C523DE6"/>
@@ -1441,7 +3525,7 @@
       </w:rPr>
     </w:lvl>
   </w:abstractNum>
-  <w:abstractNum w:abstractNumId="5" w15:restartNumberingAfterBreak="0">
+  <w:abstractNum w:abstractNumId="8" w15:restartNumberingAfterBreak="0">
     <w:nsid w:val="31873277"/>
     <w:multiLevelType w:val="hybridMultilevel"/>
     <w:tmpl w:val="546E6E04"/>
@@ -1527,7 +3611,7 @@
       </w:pPr>
     </w:lvl>
   </w:abstractNum>
-  <w:abstractNum w:abstractNumId="6" w15:restartNumberingAfterBreak="0">
+  <w:abstractNum w:abstractNumId="9" w15:restartNumberingAfterBreak="0">
     <w:nsid w:val="3518071E"/>
     <w:multiLevelType w:val="hybridMultilevel"/>
     <w:tmpl w:val="7E7CBBB6"/>
@@ -1640,7 +3724,156 @@
       </w:rPr>
     </w:lvl>
   </w:abstractNum>
-  <w:abstractNum w:abstractNumId="7" w15:restartNumberingAfterBreak="0">
+  <w:abstractNum w:abstractNumId="10" w15:restartNumberingAfterBreak="0">
+    <w:nsid w:val="361A43B6"/>
+    <w:multiLevelType w:val="multilevel"/>
+    <w:tmpl w:val="9FBC97A2"/>
+    <w:lvl w:ilvl="0">
+      <w:start w:val="1"/>
+      <w:numFmt w:val="bullet"/>
+      <w:lvlText w:val=""/>
+      <w:lvlJc w:val="left"/>
+      <w:pPr>
+        <w:tabs>
+          <w:tab w:val="num" w:pos="720"/>
+        </w:tabs>
+        <w:ind w:left="720" w:hanging="360"/>
+      </w:pPr>
+      <w:rPr>
+        <w:rFonts w:ascii="Symbol" w:hAnsi="Symbol" w:hint="default"/>
+        <w:sz w:val="20"/>
+      </w:rPr>
+    </w:lvl>
+    <w:lvl w:ilvl="1" w:tentative="1">
+      <w:start w:val="1"/>
+      <w:numFmt w:val="bullet"/>
+      <w:lvlText w:val="o"/>
+      <w:lvlJc w:val="left"/>
+      <w:pPr>
+        <w:tabs>
+          <w:tab w:val="num" w:pos="1440"/>
+        </w:tabs>
+        <w:ind w:left="1440" w:hanging="360"/>
+      </w:pPr>
+      <w:rPr>
+        <w:rFonts w:ascii="Courier New" w:hAnsi="Courier New" w:hint="default"/>
+        <w:sz w:val="20"/>
+      </w:rPr>
+    </w:lvl>
+    <w:lvl w:ilvl="2" w:tentative="1">
+      <w:start w:val="1"/>
+      <w:numFmt w:val="bullet"/>
+      <w:lvlText w:val=""/>
+      <w:lvlJc w:val="left"/>
+      <w:pPr>
+        <w:tabs>
+          <w:tab w:val="num" w:pos="2160"/>
+        </w:tabs>
+        <w:ind w:left="2160" w:hanging="360"/>
+      </w:pPr>
+      <w:rPr>
+        <w:rFonts w:ascii="Wingdings" w:hAnsi="Wingdings" w:hint="default"/>
+        <w:sz w:val="20"/>
+      </w:rPr>
+    </w:lvl>
+    <w:lvl w:ilvl="3" w:tentative="1">
+      <w:start w:val="1"/>
+      <w:numFmt w:val="bullet"/>
+      <w:lvlText w:val=""/>
+      <w:lvlJc w:val="left"/>
+      <w:pPr>
+        <w:tabs>
+          <w:tab w:val="num" w:pos="2880"/>
+        </w:tabs>
+        <w:ind w:left="2880" w:hanging="360"/>
+      </w:pPr>
+      <w:rPr>
+        <w:rFonts w:ascii="Wingdings" w:hAnsi="Wingdings" w:hint="default"/>
+        <w:sz w:val="20"/>
+      </w:rPr>
+    </w:lvl>
+    <w:lvl w:ilvl="4" w:tentative="1">
+      <w:start w:val="1"/>
+      <w:numFmt w:val="bullet"/>
+      <w:lvlText w:val=""/>
+      <w:lvlJc w:val="left"/>
+      <w:pPr>
+        <w:tabs>
+          <w:tab w:val="num" w:pos="3600"/>
+        </w:tabs>
+        <w:ind w:left="3600" w:hanging="360"/>
+      </w:pPr>
+      <w:rPr>
+        <w:rFonts w:ascii="Wingdings" w:hAnsi="Wingdings" w:hint="default"/>
+        <w:sz w:val="20"/>
+      </w:rPr>
+    </w:lvl>
+    <w:lvl w:ilvl="5" w:tentative="1">
+      <w:start w:val="1"/>
+      <w:numFmt w:val="bullet"/>
+      <w:lvlText w:val=""/>
+      <w:lvlJc w:val="left"/>
+      <w:pPr>
+        <w:tabs>
+          <w:tab w:val="num" w:pos="4320"/>
+        </w:tabs>
+        <w:ind w:left="4320" w:hanging="360"/>
+      </w:pPr>
+      <w:rPr>
+        <w:rFonts w:ascii="Wingdings" w:hAnsi="Wingdings" w:hint="default"/>
+        <w:sz w:val="20"/>
+      </w:rPr>
+    </w:lvl>
+    <w:lvl w:ilvl="6" w:tentative="1">
+      <w:start w:val="1"/>
+      <w:numFmt w:val="bullet"/>
+      <w:lvlText w:val=""/>
+      <w:lvlJc w:val="left"/>
+      <w:pPr>
+        <w:tabs>
+          <w:tab w:val="num" w:pos="5040"/>
+        </w:tabs>
+        <w:ind w:left="5040" w:hanging="360"/>
+      </w:pPr>
+      <w:rPr>
+        <w:rFonts w:ascii="Wingdings" w:hAnsi="Wingdings" w:hint="default"/>
+        <w:sz w:val="20"/>
+      </w:rPr>
+    </w:lvl>
+    <w:lvl w:ilvl="7" w:tentative="1">
+      <w:start w:val="1"/>
+      <w:numFmt w:val="bullet"/>
+      <w:lvlText w:val=""/>
+      <w:lvlJc w:val="left"/>
+      <w:pPr>
+        <w:tabs>
+          <w:tab w:val="num" w:pos="5760"/>
+        </w:tabs>
+        <w:ind w:left="5760" w:hanging="360"/>
+      </w:pPr>
+      <w:rPr>
+        <w:rFonts w:ascii="Wingdings" w:hAnsi="Wingdings" w:hint="default"/>
+        <w:sz w:val="20"/>
+      </w:rPr>
+    </w:lvl>
+    <w:lvl w:ilvl="8" w:tentative="1">
+      <w:start w:val="1"/>
+      <w:numFmt w:val="bullet"/>
+      <w:lvlText w:val=""/>
+      <w:lvlJc w:val="left"/>
+      <w:pPr>
+        <w:tabs>
+          <w:tab w:val="num" w:pos="6480"/>
+        </w:tabs>
+        <w:ind w:left="6480" w:hanging="360"/>
+      </w:pPr>
+      <w:rPr>
+        <w:rFonts w:ascii="Wingdings" w:hAnsi="Wingdings" w:hint="default"/>
+        <w:sz w:val="20"/>
+      </w:rPr>
+    </w:lvl>
+  </w:abstractNum>
+  <w:abstractNum w:abstractNumId="11" w15:restartNumberingAfterBreak="0">
     <w:nsid w:val="39801B4A"/>
     <w:multiLevelType w:val="hybridMultilevel"/>
     <w:tmpl w:val="A36A9180"/>
@@ -1752,7 +3985,305 @@
       </w:rPr>
     </w:lvl>
   </w:abstractNum>
-  <w:abstractNum w:abstractNumId="8" w15:restartNumberingAfterBreak="0">
+  <w:abstractNum w:abstractNumId="12" w15:restartNumberingAfterBreak="0">
+    <w:nsid w:val="3D2F034F"/>
+    <w:multiLevelType w:val="multilevel"/>
+    <w:tmpl w:val="329CFDE0"/>
+    <w:lvl w:ilvl="0">
+      <w:start w:val="1"/>
+      <w:numFmt w:val="bullet"/>
+      <w:lvlText w:val=""/>
+      <w:lvlJc w:val="left"/>
+      <w:pPr>
+        <w:tabs>
+          <w:tab w:val="num" w:pos="720"/>
+        </w:tabs>
+        <w:ind w:left="720" w:hanging="360"/>
+      </w:pPr>
+      <w:rPr>
+        <w:rFonts w:ascii="Symbol" w:hAnsi="Symbol" w:hint="default"/>
+        <w:sz w:val="20"/>
+      </w:rPr>
+    </w:lvl>
+    <w:lvl w:ilvl="1" w:tentative="1">
+      <w:start w:val="1"/>
+      <w:numFmt w:val="bullet"/>
+      <w:lvlText w:val="o"/>
+      <w:lvlJc w:val="left"/>
+      <w:pPr>
+        <w:tabs>
+          <w:tab w:val="num" w:pos="1440"/>
+        </w:tabs>
+        <w:ind w:left="1440" w:hanging="360"/>
+      </w:pPr>
+      <w:rPr>
+        <w:rFonts w:ascii="Courier New" w:hAnsi="Courier New" w:hint="default"/>
+        <w:sz w:val="20"/>
+      </w:rPr>
+    </w:lvl>
+    <w:lvl w:ilvl="2" w:tentative="1">
+      <w:start w:val="1"/>
+      <w:numFmt w:val="bullet"/>
+      <w:lvlText w:val=""/>
+      <w:lvlJc w:val="left"/>
+      <w:pPr>
+        <w:tabs>
+          <w:tab w:val="num" w:pos="2160"/>
+        </w:tabs>
+        <w:ind w:left="2160" w:hanging="360"/>
+      </w:pPr>
+      <w:rPr>
+        <w:rFonts w:ascii="Wingdings" w:hAnsi="Wingdings" w:hint="default"/>
+        <w:sz w:val="20"/>
+      </w:rPr>
+    </w:lvl>
+    <w:lvl w:ilvl="3" w:tentative="1">
+      <w:start w:val="1"/>
+      <w:numFmt w:val="bullet"/>
+      <w:lvlText w:val=""/>
+      <w:lvlJc w:val="left"/>
+      <w:pPr>
+        <w:tabs>
+          <w:tab w:val="num" w:pos="2880"/>
+        </w:tabs>
+        <w:ind w:left="2880" w:hanging="360"/>
+      </w:pPr>
+      <w:rPr>
+        <w:rFonts w:ascii="Wingdings" w:hAnsi="Wingdings" w:hint="default"/>
+        <w:sz w:val="20"/>
+      </w:rPr>
+    </w:lvl>
+    <w:lvl w:ilvl="4" w:tentative="1">
+      <w:start w:val="1"/>
+      <w:numFmt w:val="bullet"/>
+      <w:lvlText w:val=""/>
+      <w:lvlJc w:val="left"/>
+      <w:pPr>
+        <w:tabs>
+          <w:tab w:val="num" w:pos="3600"/>
+        </w:tabs>
+        <w:ind w:left="3600" w:hanging="360"/>
+      </w:pPr>
+      <w:rPr>
+        <w:rFonts w:ascii="Wingdings" w:hAnsi="Wingdings" w:hint="default"/>
+        <w:sz w:val="20"/>
+      </w:rPr>
+    </w:lvl>
+    <w:lvl w:ilvl="5" w:tentative="1">
+      <w:start w:val="1"/>
+      <w:numFmt w:val="bullet"/>
+      <w:lvlText w:val=""/>
+      <w:lvlJc w:val="left"/>
+      <w:pPr>
+        <w:tabs>
+          <w:tab w:val="num" w:pos="4320"/>
+        </w:tabs>
+        <w:ind w:left="4320" w:hanging="360"/>
+      </w:pPr>
+      <w:rPr>
+        <w:rFonts w:ascii="Wingdings" w:hAnsi="Wingdings" w:hint="default"/>
+        <w:sz w:val="20"/>
+      </w:rPr>
+    </w:lvl>
+    <w:lvl w:ilvl="6" w:tentative="1">
+      <w:start w:val="1"/>
+      <w:numFmt w:val="bullet"/>
+      <w:lvlText w:val=""/>
+      <w:lvlJc w:val="left"/>
+      <w:pPr>
+        <w:tabs>
+          <w:tab w:val="num" w:pos="5040"/>
+        </w:tabs>
+        <w:ind w:left="5040" w:hanging="360"/>
+      </w:pPr>
+      <w:rPr>
+        <w:rFonts w:ascii="Wingdings" w:hAnsi="Wingdings" w:hint="default"/>
+        <w:sz w:val="20"/>
+      </w:rPr>
+    </w:lvl>
+    <w:lvl w:ilvl="7" w:tentative="1">
+      <w:start w:val="1"/>
+      <w:numFmt w:val="bullet"/>
+      <w:lvlText w:val=""/>
+      <w:lvlJc w:val="left"/>
+      <w:pPr>
+        <w:tabs>
+          <w:tab w:val="num" w:pos="5760"/>
+        </w:tabs>
+        <w:ind w:left="5760" w:hanging="360"/>
+      </w:pPr>
+      <w:rPr>
+        <w:rFonts w:ascii="Wingdings" w:hAnsi="Wingdings" w:hint="default"/>
+        <w:sz w:val="20"/>
+      </w:rPr>
+    </w:lvl>
+    <w:lvl w:ilvl="8" w:tentative="1">
+      <w:start w:val="1"/>
+      <w:numFmt w:val="bullet"/>
+      <w:lvlText w:val=""/>
+      <w:lvlJc w:val="left"/>
+      <w:pPr>
+        <w:tabs>
+          <w:tab w:val="num" w:pos="6480"/>
+        </w:tabs>
+        <w:ind w:left="6480" w:hanging="360"/>
+      </w:pPr>
+      <w:rPr>
+        <w:rFonts w:ascii="Wingdings" w:hAnsi="Wingdings" w:hint="default"/>
+        <w:sz w:val="20"/>
+      </w:rPr>
+    </w:lvl>
+  </w:abstractNum>
+  <w:abstractNum w:abstractNumId="13" w15:restartNumberingAfterBreak="0">
+    <w:nsid w:val="420157FA"/>
+    <w:multiLevelType w:val="multilevel"/>
+    <w:tmpl w:val="C7409896"/>
+    <w:lvl w:ilvl="0">
+      <w:start w:val="1"/>
+      <w:numFmt w:val="bullet"/>
+      <w:lvlText w:val=""/>
+      <w:lvlJc w:val="left"/>
+      <w:pPr>
+        <w:tabs>
+          <w:tab w:val="num" w:pos="720"/>
+        </w:tabs>
+        <w:ind w:left="720" w:hanging="360"/>
+      </w:pPr>
+      <w:rPr>
+        <w:rFonts w:ascii="Symbol" w:hAnsi="Symbol" w:hint="default"/>
+        <w:sz w:val="20"/>
+      </w:rPr>
+    </w:lvl>
+    <w:lvl w:ilvl="1" w:tentative="1">
+      <w:start w:val="1"/>
+      <w:numFmt w:val="bullet"/>
+      <w:lvlText w:val="o"/>
+      <w:lvlJc w:val="left"/>
+      <w:pPr>
+        <w:tabs>
+          <w:tab w:val="num" w:pos="1440"/>
+        </w:tabs>
+        <w:ind w:left="1440" w:hanging="360"/>
+      </w:pPr>
+      <w:rPr>
+        <w:rFonts w:ascii="Courier New" w:hAnsi="Courier New" w:hint="default"/>
+        <w:sz w:val="20"/>
+      </w:rPr>
+    </w:lvl>
+    <w:lvl w:ilvl="2" w:tentative="1">
+      <w:start w:val="1"/>
+      <w:numFmt w:val="bullet"/>
+      <w:lvlText w:val=""/>
+      <w:lvlJc w:val="left"/>
+      <w:pPr>
+        <w:tabs>
+          <w:tab w:val="num" w:pos="2160"/>
+        </w:tabs>
+        <w:ind w:left="2160" w:hanging="360"/>
+      </w:pPr>
+      <w:rPr>
+        <w:rFonts w:ascii="Wingdings" w:hAnsi="Wingdings" w:hint="default"/>
+        <w:sz w:val="20"/>
+      </w:rPr>
+    </w:lvl>
+    <w:lvl w:ilvl="3" w:tentative="1">
+      <w:start w:val="1"/>
+      <w:numFmt w:val="bullet"/>
+      <w:lvlText w:val=""/>
+      <w:lvlJc w:val="left"/>
+      <w:pPr>
+        <w:tabs>
+          <w:tab w:val="num" w:pos="2880"/>
+        </w:tabs>
+        <w:ind w:left="2880" w:hanging="360"/>
+      </w:pPr>
+      <w:rPr>
+        <w:rFonts w:ascii="Wingdings" w:hAnsi="Wingdings" w:hint="default"/>
+        <w:sz w:val="20"/>
+      </w:rPr>
+    </w:lvl>
+    <w:lvl w:ilvl="4" w:tentative="1">
+      <w:start w:val="1"/>
+      <w:numFmt w:val="bullet"/>
+      <w:lvlText w:val=""/>
+      <w:lvlJc w:val="left"/>
+      <w:pPr>
+        <w:tabs>
+          <w:tab w:val="num" w:pos="3600"/>
+        </w:tabs>
+        <w:ind w:left="3600" w:hanging="360"/>
+      </w:pPr>
+      <w:rPr>
+        <w:rFonts w:ascii="Wingdings" w:hAnsi="Wingdings" w:hint="default"/>
+        <w:sz w:val="20"/>
+      </w:rPr>
+    </w:lvl>
+    <w:lvl w:ilvl="5" w:tentative="1">
+      <w:start w:val="1"/>
+      <w:numFmt w:val="bullet"/>
+      <w:lvlText w:val=""/>
+      <w:lvlJc w:val="left"/>
+      <w:pPr>
+        <w:tabs>
+          <w:tab w:val="num" w:pos="4320"/>
+        </w:tabs>
+        <w:ind w:left="4320" w:hanging="360"/>
+      </w:pPr>
+      <w:rPr>
+        <w:rFonts w:ascii="Wingdings" w:hAnsi="Wingdings" w:hint="default"/>
+        <w:sz w:val="20"/>
+      </w:rPr>
+    </w:lvl>
+    <w:lvl w:ilvl="6" w:tentative="1">
+      <w:start w:val="1"/>
+      <w:numFmt w:val="bullet"/>
+      <w:lvlText w:val=""/>
+      <w:lvlJc w:val="left"/>
+      <w:pPr>
+        <w:tabs>
+          <w:tab w:val="num" w:pos="5040"/>
+        </w:tabs>
+        <w:ind w:left="5040" w:hanging="360"/>
+      </w:pPr>
+      <w:rPr>
+        <w:rFonts w:ascii="Wingdings" w:hAnsi="Wingdings" w:hint="default"/>
+        <w:sz w:val="20"/>
+      </w:rPr>
+    </w:lvl>
+    <w:lvl w:ilvl="7" w:tentative="1">
+      <w:start w:val="1"/>
+      <w:numFmt w:val="bullet"/>
+      <w:lvlText w:val=""/>
+      <w:lvlJc w:val="left"/>
+      <w:pPr>
+        <w:tabs>
+          <w:tab w:val="num" w:pos="5760"/>
+        </w:tabs>
+        <w:ind w:left="5760" w:hanging="360"/>
+      </w:pPr>
+      <w:rPr>
+        <w:rFonts w:ascii="Wingdings" w:hAnsi="Wingdings" w:hint="default"/>
+        <w:sz w:val="20"/>
+      </w:rPr>
+    </w:lvl>
+    <w:lvl w:ilvl="8" w:tentative="1">
+      <w:start w:val="1"/>
+      <w:numFmt w:val="bullet"/>
+      <w:lvlText w:val=""/>
+      <w:lvlJc w:val="left"/>
+      <w:pPr>
+        <w:tabs>
+          <w:tab w:val="num" w:pos="6480"/>
+        </w:tabs>
+        <w:ind w:left="6480" w:hanging="360"/>
+      </w:pPr>
+      <w:rPr>
+        <w:rFonts w:ascii="Wingdings" w:hAnsi="Wingdings" w:hint="default"/>
+        <w:sz w:val="20"/>
+      </w:rPr>
+    </w:lvl>
+  </w:abstractNum>
+  <w:abstractNum w:abstractNumId="14" w15:restartNumberingAfterBreak="0">
     <w:nsid w:val="462367F2"/>
     <w:multiLevelType w:val="hybridMultilevel"/>
     <w:tmpl w:val="1B12CD48"/>
@@ -1865,7 +4396,305 @@
       </w:rPr>
     </w:lvl>
   </w:abstractNum>
-  <w:abstractNum w:abstractNumId="9" w15:restartNumberingAfterBreak="0">
+  <w:abstractNum w:abstractNumId="15" w15:restartNumberingAfterBreak="0">
+    <w:nsid w:val="491C0827"/>
+    <w:multiLevelType w:val="multilevel"/>
+    <w:tmpl w:val="D61EF42A"/>
+    <w:lvl w:ilvl="0">
+      <w:start w:val="1"/>
+      <w:numFmt w:val="bullet"/>
+      <w:lvlText w:val=""/>
+      <w:lvlJc w:val="left"/>
+      <w:pPr>
+        <w:tabs>
+          <w:tab w:val="num" w:pos="720"/>
+        </w:tabs>
+        <w:ind w:left="720" w:hanging="360"/>
+      </w:pPr>
+      <w:rPr>
+        <w:rFonts w:ascii="Symbol" w:hAnsi="Symbol" w:hint="default"/>
+        <w:sz w:val="20"/>
+      </w:rPr>
+    </w:lvl>
+    <w:lvl w:ilvl="1" w:tentative="1">
+      <w:start w:val="1"/>
+      <w:numFmt w:val="bullet"/>
+      <w:lvlText w:val="o"/>
+      <w:lvlJc w:val="left"/>
+      <w:pPr>
+        <w:tabs>
+          <w:tab w:val="num" w:pos="1440"/>
+        </w:tabs>
+        <w:ind w:left="1440" w:hanging="360"/>
+      </w:pPr>
+      <w:rPr>
+        <w:rFonts w:ascii="Courier New" w:hAnsi="Courier New" w:hint="default"/>
+        <w:sz w:val="20"/>
+      </w:rPr>
+    </w:lvl>
+    <w:lvl w:ilvl="2" w:tentative="1">
+      <w:start w:val="1"/>
+      <w:numFmt w:val="bullet"/>
+      <w:lvlText w:val=""/>
+      <w:lvlJc w:val="left"/>
+      <w:pPr>
+        <w:tabs>
+          <w:tab w:val="num" w:pos="2160"/>
+        </w:tabs>
+        <w:ind w:left="2160" w:hanging="360"/>
+      </w:pPr>
+      <w:rPr>
+        <w:rFonts w:ascii="Wingdings" w:hAnsi="Wingdings" w:hint="default"/>
+        <w:sz w:val="20"/>
+      </w:rPr>
+    </w:lvl>
+    <w:lvl w:ilvl="3" w:tentative="1">
+      <w:start w:val="1"/>
+      <w:numFmt w:val="bullet"/>
+      <w:lvlText w:val=""/>
+      <w:lvlJc w:val="left"/>
+      <w:pPr>
+        <w:tabs>
+          <w:tab w:val="num" w:pos="2880"/>
+        </w:tabs>
+        <w:ind w:left="2880" w:hanging="360"/>
+      </w:pPr>
+      <w:rPr>
+        <w:rFonts w:ascii="Wingdings" w:hAnsi="Wingdings" w:hint="default"/>
+        <w:sz w:val="20"/>
+      </w:rPr>
+    </w:lvl>
+    <w:lvl w:ilvl="4" w:tentative="1">
+      <w:start w:val="1"/>
+      <w:numFmt w:val="bullet"/>
+      <w:lvlText w:val=""/>
+      <w:lvlJc w:val="left"/>
+      <w:pPr>
+        <w:tabs>
+          <w:tab w:val="num" w:pos="3600"/>
+        </w:tabs>
+        <w:ind w:left="3600" w:hanging="360"/>
+      </w:pPr>
+      <w:rPr>
+        <w:rFonts w:ascii="Wingdings" w:hAnsi="Wingdings" w:hint="default"/>
+        <w:sz w:val="20"/>
+      </w:rPr>
+    </w:lvl>
+    <w:lvl w:ilvl="5" w:tentative="1">
+      <w:start w:val="1"/>
+      <w:numFmt w:val="bullet"/>
+      <w:lvlText w:val=""/>
+      <w:lvlJc w:val="left"/>
+      <w:pPr>
+        <w:tabs>
+          <w:tab w:val="num" w:pos="4320"/>
+        </w:tabs>
+        <w:ind w:left="4320" w:hanging="360"/>
+      </w:pPr>
+      <w:rPr>
+        <w:rFonts w:ascii="Wingdings" w:hAnsi="Wingdings" w:hint="default"/>
+        <w:sz w:val="20"/>
+      </w:rPr>
+    </w:lvl>
+    <w:lvl w:ilvl="6" w:tentative="1">
+      <w:start w:val="1"/>
+      <w:numFmt w:val="bullet"/>
+      <w:lvlText w:val=""/>
+      <w:lvlJc w:val="left"/>
+      <w:pPr>
+        <w:tabs>
+          <w:tab w:val="num" w:pos="5040"/>
+        </w:tabs>
+        <w:ind w:left="5040" w:hanging="360"/>
+      </w:pPr>
+      <w:rPr>
+        <w:rFonts w:ascii="Wingdings" w:hAnsi="Wingdings" w:hint="default"/>
+        <w:sz w:val="20"/>
+      </w:rPr>
+    </w:lvl>
+    <w:lvl w:ilvl="7" w:tentative="1">
+      <w:start w:val="1"/>
+      <w:numFmt w:val="bullet"/>
+      <w:lvlText w:val=""/>
+      <w:lvlJc w:val="left"/>
+      <w:pPr>
+        <w:tabs>
+          <w:tab w:val="num" w:pos="5760"/>
+        </w:tabs>
+        <w:ind w:left="5760" w:hanging="360"/>
+      </w:pPr>
+      <w:rPr>
+        <w:rFonts w:ascii="Wingdings" w:hAnsi="Wingdings" w:hint="default"/>
+        <w:sz w:val="20"/>
+      </w:rPr>
+    </w:lvl>
+    <w:lvl w:ilvl="8" w:tentative="1">
+      <w:start w:val="1"/>
+      <w:numFmt w:val="bullet"/>
+      <w:lvlText w:val=""/>
+      <w:lvlJc w:val="left"/>
+      <w:pPr>
+        <w:tabs>
+          <w:tab w:val="num" w:pos="6480"/>
+        </w:tabs>
+        <w:ind w:left="6480" w:hanging="360"/>
+      </w:pPr>
+      <w:rPr>
+        <w:rFonts w:ascii="Wingdings" w:hAnsi="Wingdings" w:hint="default"/>
+        <w:sz w:val="20"/>
+      </w:rPr>
+    </w:lvl>
+  </w:abstractNum>
+  <w:abstractNum w:abstractNumId="16" w15:restartNumberingAfterBreak="0">
+    <w:nsid w:val="4C064350"/>
+    <w:multiLevelType w:val="multilevel"/>
+    <w:tmpl w:val="3782DC5A"/>
+    <w:lvl w:ilvl="0">
+      <w:start w:val="1"/>
+      <w:numFmt w:val="bullet"/>
+      <w:lvlText w:val=""/>
+      <w:lvlJc w:val="left"/>
+      <w:pPr>
+        <w:tabs>
+          <w:tab w:val="num" w:pos="720"/>
+        </w:tabs>
+        <w:ind w:left="720" w:hanging="360"/>
+      </w:pPr>
+      <w:rPr>
+        <w:rFonts w:ascii="Symbol" w:hAnsi="Symbol" w:hint="default"/>
+        <w:sz w:val="20"/>
+      </w:rPr>
+    </w:lvl>
+    <w:lvl w:ilvl="1" w:tentative="1">
+      <w:start w:val="1"/>
+      <w:numFmt w:val="bullet"/>
+      <w:lvlText w:val="o"/>
+      <w:lvlJc w:val="left"/>
+      <w:pPr>
+        <w:tabs>
+          <w:tab w:val="num" w:pos="1440"/>
+        </w:tabs>
+        <w:ind w:left="1440" w:hanging="360"/>
+      </w:pPr>
+      <w:rPr>
+        <w:rFonts w:ascii="Courier New" w:hAnsi="Courier New" w:hint="default"/>
+        <w:sz w:val="20"/>
+      </w:rPr>
+    </w:lvl>
+    <w:lvl w:ilvl="2" w:tentative="1">
+      <w:start w:val="1"/>
+      <w:numFmt w:val="bullet"/>
+      <w:lvlText w:val=""/>
+      <w:lvlJc w:val="left"/>
+      <w:pPr>
+        <w:tabs>
+          <w:tab w:val="num" w:pos="2160"/>
+        </w:tabs>
+        <w:ind w:left="2160" w:hanging="360"/>
+      </w:pPr>
+      <w:rPr>
+        <w:rFonts w:ascii="Wingdings" w:hAnsi="Wingdings" w:hint="default"/>
+        <w:sz w:val="20"/>
+      </w:rPr>
+    </w:lvl>
+    <w:lvl w:ilvl="3" w:tentative="1">
+      <w:start w:val="1"/>
+      <w:numFmt w:val="bullet"/>
+      <w:lvlText w:val=""/>
+      <w:lvlJc w:val="left"/>
+      <w:pPr>
+        <w:tabs>
+          <w:tab w:val="num" w:pos="2880"/>
+        </w:tabs>
+        <w:ind w:left="2880" w:hanging="360"/>
+      </w:pPr>
+      <w:rPr>
+        <w:rFonts w:ascii="Wingdings" w:hAnsi="Wingdings" w:hint="default"/>
+        <w:sz w:val="20"/>
+      </w:rPr>
+    </w:lvl>
+    <w:lvl w:ilvl="4" w:tentative="1">
+      <w:start w:val="1"/>
+      <w:numFmt w:val="bullet"/>
+      <w:lvlText w:val=""/>
+      <w:lvlJc w:val="left"/>
+      <w:pPr>
+        <w:tabs>
+          <w:tab w:val="num" w:pos="3600"/>
+        </w:tabs>
+        <w:ind w:left="3600" w:hanging="360"/>
+      </w:pPr>
+      <w:rPr>
+        <w:rFonts w:ascii="Wingdings" w:hAnsi="Wingdings" w:hint="default"/>
+        <w:sz w:val="20"/>
+      </w:rPr>
+    </w:lvl>
+    <w:lvl w:ilvl="5" w:tentative="1">
+      <w:start w:val="1"/>
+      <w:numFmt w:val="bullet"/>
+      <w:lvlText w:val=""/>
+      <w:lvlJc w:val="left"/>
+      <w:pPr>
+        <w:tabs>
+          <w:tab w:val="num" w:pos="4320"/>
+        </w:tabs>
+        <w:ind w:left="4320" w:hanging="360"/>
+      </w:pPr>
+      <w:rPr>
+        <w:rFonts w:ascii="Wingdings" w:hAnsi="Wingdings" w:hint="default"/>
+        <w:sz w:val="20"/>
+      </w:rPr>
+    </w:lvl>
+    <w:lvl w:ilvl="6" w:tentative="1">
+      <w:start w:val="1"/>
+      <w:numFmt w:val="bullet"/>
+      <w:lvlText w:val=""/>
+      <w:lvlJc w:val="left"/>
+      <w:pPr>
+        <w:tabs>
+          <w:tab w:val="num" w:pos="5040"/>
+        </w:tabs>
+        <w:ind w:left="5040" w:hanging="360"/>
+      </w:pPr>
+      <w:rPr>
+        <w:rFonts w:ascii="Wingdings" w:hAnsi="Wingdings" w:hint="default"/>
+        <w:sz w:val="20"/>
+      </w:rPr>
+    </w:lvl>
+    <w:lvl w:ilvl="7" w:tentative="1">
+      <w:start w:val="1"/>
+      <w:numFmt w:val="bullet"/>
+      <w:lvlText w:val=""/>
+      <w:lvlJc w:val="left"/>
+      <w:pPr>
+        <w:tabs>
+          <w:tab w:val="num" w:pos="5760"/>
+        </w:tabs>
+        <w:ind w:left="5760" w:hanging="360"/>
+      </w:pPr>
+      <w:rPr>
+        <w:rFonts w:ascii="Wingdings" w:hAnsi="Wingdings" w:hint="default"/>
+        <w:sz w:val="20"/>
+      </w:rPr>
+    </w:lvl>
+    <w:lvl w:ilvl="8" w:tentative="1">
+      <w:start w:val="1"/>
+      <w:numFmt w:val="bullet"/>
+      <w:lvlText w:val=""/>
+      <w:lvlJc w:val="left"/>
+      <w:pPr>
+        <w:tabs>
+          <w:tab w:val="num" w:pos="6480"/>
+        </w:tabs>
+        <w:ind w:left="6480" w:hanging="360"/>
+      </w:pPr>
+      <w:rPr>
+        <w:rFonts w:ascii="Wingdings" w:hAnsi="Wingdings" w:hint="default"/>
+        <w:sz w:val="20"/>
+      </w:rPr>
+    </w:lvl>
+  </w:abstractNum>
+  <w:abstractNum w:abstractNumId="17" w15:restartNumberingAfterBreak="0">
     <w:nsid w:val="4DF20EA6"/>
     <w:multiLevelType w:val="hybridMultilevel"/>
     <w:tmpl w:val="052CA666"/>
@@ -1954,7 +4783,156 @@
       </w:pPr>
     </w:lvl>
   </w:abstractNum>
-  <w:abstractNum w:abstractNumId="10" w15:restartNumberingAfterBreak="0">
+  <w:abstractNum w:abstractNumId="18" w15:restartNumberingAfterBreak="0">
+    <w:nsid w:val="4E98632C"/>
+    <w:multiLevelType w:val="multilevel"/>
+    <w:tmpl w:val="C8E8F8E8"/>
+    <w:lvl w:ilvl="0">
+      <w:start w:val="1"/>
+      <w:numFmt w:val="bullet"/>
+      <w:lvlText w:val=""/>
+      <w:lvlJc w:val="left"/>
+      <w:pPr>
+        <w:tabs>
+          <w:tab w:val="num" w:pos="720"/>
+        </w:tabs>
+        <w:ind w:left="720" w:hanging="360"/>
+      </w:pPr>
+      <w:rPr>
+        <w:rFonts w:ascii="Symbol" w:hAnsi="Symbol" w:hint="default"/>
+        <w:sz w:val="20"/>
+      </w:rPr>
+    </w:lvl>
+    <w:lvl w:ilvl="1" w:tentative="1">
+      <w:start w:val="1"/>
+      <w:numFmt w:val="bullet"/>
+      <w:lvlText w:val="o"/>
+      <w:lvlJc w:val="left"/>
+      <w:pPr>
+        <w:tabs>
+          <w:tab w:val="num" w:pos="1440"/>
+        </w:tabs>
+        <w:ind w:left="1440" w:hanging="360"/>
+      </w:pPr>
+      <w:rPr>
+        <w:rFonts w:ascii="Courier New" w:hAnsi="Courier New" w:hint="default"/>
+        <w:sz w:val="20"/>
+      </w:rPr>
+    </w:lvl>
+    <w:lvl w:ilvl="2" w:tentative="1">
+      <w:start w:val="1"/>
+      <w:numFmt w:val="bullet"/>
+      <w:lvlText w:val=""/>
+      <w:lvlJc w:val="left"/>
+      <w:pPr>
+        <w:tabs>
+          <w:tab w:val="num" w:pos="2160"/>
+        </w:tabs>
+        <w:ind w:left="2160" w:hanging="360"/>
+      </w:pPr>
+      <w:rPr>
+        <w:rFonts w:ascii="Wingdings" w:hAnsi="Wingdings" w:hint="default"/>
+        <w:sz w:val="20"/>
+      </w:rPr>
+    </w:lvl>
+    <w:lvl w:ilvl="3" w:tentative="1">
+      <w:start w:val="1"/>
+      <w:numFmt w:val="bullet"/>
+      <w:lvlText w:val=""/>
+      <w:lvlJc w:val="left"/>
+      <w:pPr>
+        <w:tabs>
+          <w:tab w:val="num" w:pos="2880"/>
+        </w:tabs>
+        <w:ind w:left="2880" w:hanging="360"/>
+      </w:pPr>
+      <w:rPr>
+        <w:rFonts w:ascii="Wingdings" w:hAnsi="Wingdings" w:hint="default"/>
+        <w:sz w:val="20"/>
+      </w:rPr>
+    </w:lvl>
+    <w:lvl w:ilvl="4" w:tentative="1">
+      <w:start w:val="1"/>
+      <w:numFmt w:val="bullet"/>
+      <w:lvlText w:val=""/>
+      <w:lvlJc w:val="left"/>
+      <w:pPr>
+        <w:tabs>
+          <w:tab w:val="num" w:pos="3600"/>
+        </w:tabs>
+        <w:ind w:left="3600" w:hanging="360"/>
+      </w:pPr>
+      <w:rPr>
+        <w:rFonts w:ascii="Wingdings" w:hAnsi="Wingdings" w:hint="default"/>
+        <w:sz w:val="20"/>
+      </w:rPr>
+    </w:lvl>
+    <w:lvl w:ilvl="5" w:tentative="1">
+      <w:start w:val="1"/>
+      <w:numFmt w:val="bullet"/>
+      <w:lvlText w:val=""/>
+      <w:lvlJc w:val="left"/>
+      <w:pPr>
+        <w:tabs>
+          <w:tab w:val="num" w:pos="4320"/>
+        </w:tabs>
+        <w:ind w:left="4320" w:hanging="360"/>
+      </w:pPr>
+      <w:rPr>
+        <w:rFonts w:ascii="Wingdings" w:hAnsi="Wingdings" w:hint="default"/>
+        <w:sz w:val="20"/>
+      </w:rPr>
+    </w:lvl>
+    <w:lvl w:ilvl="6" w:tentative="1">
+      <w:start w:val="1"/>
+      <w:numFmt w:val="bullet"/>
+      <w:lvlText w:val=""/>
+      <w:lvlJc w:val="left"/>
+      <w:pPr>
+        <w:tabs>
+          <w:tab w:val="num" w:pos="5040"/>
+        </w:tabs>
+        <w:ind w:left="5040" w:hanging="360"/>
+      </w:pPr>
+      <w:rPr>
+        <w:rFonts w:ascii="Wingdings" w:hAnsi="Wingdings" w:hint="default"/>
+        <w:sz w:val="20"/>
+      </w:rPr>
+    </w:lvl>
+    <w:lvl w:ilvl="7" w:tentative="1">
+      <w:start w:val="1"/>
+      <w:numFmt w:val="bullet"/>
+      <w:lvlText w:val=""/>
+      <w:lvlJc w:val="left"/>
+      <w:pPr>
+        <w:tabs>
+          <w:tab w:val="num" w:pos="5760"/>
+        </w:tabs>
+        <w:ind w:left="5760" w:hanging="360"/>
+      </w:pPr>
+      <w:rPr>
+        <w:rFonts w:ascii="Wingdings" w:hAnsi="Wingdings" w:hint="default"/>
+        <w:sz w:val="20"/>
+      </w:rPr>
+    </w:lvl>
+    <w:lvl w:ilvl="8" w:tentative="1">
+      <w:start w:val="1"/>
+      <w:numFmt w:val="bullet"/>
+      <w:lvlText w:val=""/>
+      <w:lvlJc w:val="left"/>
+      <w:pPr>
+        <w:tabs>
+          <w:tab w:val="num" w:pos="6480"/>
+        </w:tabs>
+        <w:ind w:left="6480" w:hanging="360"/>
+      </w:pPr>
+      <w:rPr>
+        <w:rFonts w:ascii="Wingdings" w:hAnsi="Wingdings" w:hint="default"/>
+        <w:sz w:val="20"/>
+      </w:rPr>
+    </w:lvl>
+  </w:abstractNum>
+  <w:abstractNum w:abstractNumId="19" w15:restartNumberingAfterBreak="0">
     <w:nsid w:val="4FAF4502"/>
     <w:multiLevelType w:val="multilevel"/>
     <w:tmpl w:val="48FEA668"/>
@@ -2103,7 +5081,7 @@
       </w:rPr>
     </w:lvl>
   </w:abstractNum>
-  <w:abstractNum w:abstractNumId="11" w15:restartNumberingAfterBreak="0">
+  <w:abstractNum w:abstractNumId="20" w15:restartNumberingAfterBreak="0">
     <w:nsid w:val="510D3163"/>
     <w:multiLevelType w:val="hybridMultilevel"/>
     <w:tmpl w:val="4BD6D8CC"/>
@@ -2192,7 +5170,7 @@
       </w:pPr>
     </w:lvl>
   </w:abstractNum>
-  <w:abstractNum w:abstractNumId="12" w15:restartNumberingAfterBreak="0">
+  <w:abstractNum w:abstractNumId="21" w15:restartNumberingAfterBreak="0">
     <w:nsid w:val="55684B5C"/>
     <w:multiLevelType w:val="hybridMultilevel"/>
     <w:tmpl w:val="B41E9662"/>
@@ -2304,7 +5282,7 @@
       </w:rPr>
     </w:lvl>
   </w:abstractNum>
-  <w:abstractNum w:abstractNumId="13" w15:restartNumberingAfterBreak="0">
+  <w:abstractNum w:abstractNumId="22" w15:restartNumberingAfterBreak="0">
     <w:nsid w:val="55F01457"/>
     <w:multiLevelType w:val="hybridMultilevel"/>
     <w:tmpl w:val="A48046D6"/>
@@ -2416,7 +5394,156 @@
       </w:rPr>
     </w:lvl>
   </w:abstractNum>
-  <w:abstractNum w:abstractNumId="14" w15:restartNumberingAfterBreak="0">
+  <w:abstractNum w:abstractNumId="23" w15:restartNumberingAfterBreak="0">
+    <w:nsid w:val="571E6EFE"/>
+    <w:multiLevelType w:val="multilevel"/>
+    <w:tmpl w:val="AC3C09E6"/>
+    <w:lvl w:ilvl="0">
+      <w:start w:val="1"/>
+      <w:numFmt w:val="bullet"/>
+      <w:lvlText w:val=""/>
+      <w:lvlJc w:val="left"/>
+      <w:pPr>
+        <w:tabs>
+          <w:tab w:val="num" w:pos="720"/>
+        </w:tabs>
+        <w:ind w:left="720" w:hanging="360"/>
+      </w:pPr>
+      <w:rPr>
+        <w:rFonts w:ascii="Symbol" w:hAnsi="Symbol" w:hint="default"/>
+        <w:sz w:val="20"/>
+      </w:rPr>
+    </w:lvl>
+    <w:lvl w:ilvl="1" w:tentative="1">
+      <w:start w:val="1"/>
+      <w:numFmt w:val="bullet"/>
+      <w:lvlText w:val="o"/>
+      <w:lvlJc w:val="left"/>
+      <w:pPr>
+        <w:tabs>
+          <w:tab w:val="num" w:pos="1440"/>
+        </w:tabs>
+        <w:ind w:left="1440" w:hanging="360"/>
+      </w:pPr>
+      <w:rPr>
+        <w:rFonts w:ascii="Courier New" w:hAnsi="Courier New" w:hint="default"/>
+        <w:sz w:val="20"/>
+      </w:rPr>
+    </w:lvl>
+    <w:lvl w:ilvl="2" w:tentative="1">
+      <w:start w:val="1"/>
+      <w:numFmt w:val="bullet"/>
+      <w:lvlText w:val=""/>
+      <w:lvlJc w:val="left"/>
+      <w:pPr>
+        <w:tabs>
+          <w:tab w:val="num" w:pos="2160"/>
+        </w:tabs>
+        <w:ind w:left="2160" w:hanging="360"/>
+      </w:pPr>
+      <w:rPr>
+        <w:rFonts w:ascii="Wingdings" w:hAnsi="Wingdings" w:hint="default"/>
+        <w:sz w:val="20"/>
+      </w:rPr>
+    </w:lvl>
+    <w:lvl w:ilvl="3" w:tentative="1">
+      <w:start w:val="1"/>
+      <w:numFmt w:val="bullet"/>
+      <w:lvlText w:val=""/>
+      <w:lvlJc w:val="left"/>
+      <w:pPr>
+        <w:tabs>
+          <w:tab w:val="num" w:pos="2880"/>
+        </w:tabs>
+        <w:ind w:left="2880" w:hanging="360"/>
+      </w:pPr>
+      <w:rPr>
+        <w:rFonts w:ascii="Wingdings" w:hAnsi="Wingdings" w:hint="default"/>
+        <w:sz w:val="20"/>
+      </w:rPr>
+    </w:lvl>
+    <w:lvl w:ilvl="4" w:tentative="1">
+      <w:start w:val="1"/>
+      <w:numFmt w:val="bullet"/>
+      <w:lvlText w:val=""/>
+      <w:lvlJc w:val="left"/>
+      <w:pPr>
+        <w:tabs>
+          <w:tab w:val="num" w:pos="3600"/>
+        </w:tabs>
+        <w:ind w:left="3600" w:hanging="360"/>
+      </w:pPr>
+      <w:rPr>
+        <w:rFonts w:ascii="Wingdings" w:hAnsi="Wingdings" w:hint="default"/>
+        <w:sz w:val="20"/>
+      </w:rPr>
+    </w:lvl>
+    <w:lvl w:ilvl="5" w:tentative="1">
+      <w:start w:val="1"/>
+      <w:numFmt w:val="bullet"/>
+      <w:lvlText w:val=""/>
+      <w:lvlJc w:val="left"/>
+      <w:pPr>
+        <w:tabs>
+          <w:tab w:val="num" w:pos="4320"/>
+        </w:tabs>
+        <w:ind w:left="4320" w:hanging="360"/>
+      </w:pPr>
+      <w:rPr>
+        <w:rFonts w:ascii="Wingdings" w:hAnsi="Wingdings" w:hint="default"/>
+        <w:sz w:val="20"/>
+      </w:rPr>
+    </w:lvl>
+    <w:lvl w:ilvl="6" w:tentative="1">
+      <w:start w:val="1"/>
+      <w:numFmt w:val="bullet"/>
+      <w:lvlText w:val=""/>
+      <w:lvlJc w:val="left"/>
+      <w:pPr>
+        <w:tabs>
+          <w:tab w:val="num" w:pos="5040"/>
+        </w:tabs>
+        <w:ind w:left="5040" w:hanging="360"/>
+      </w:pPr>
+      <w:rPr>
+        <w:rFonts w:ascii="Wingdings" w:hAnsi="Wingdings" w:hint="default"/>
+        <w:sz w:val="20"/>
+      </w:rPr>
+    </w:lvl>
+    <w:lvl w:ilvl="7" w:tentative="1">
+      <w:start w:val="1"/>
+      <w:numFmt w:val="bullet"/>
+      <w:lvlText w:val=""/>
+      <w:lvlJc w:val="left"/>
+      <w:pPr>
+        <w:tabs>
+          <w:tab w:val="num" w:pos="5760"/>
+        </w:tabs>
+        <w:ind w:left="5760" w:hanging="360"/>
+      </w:pPr>
+      <w:rPr>
+        <w:rFonts w:ascii="Wingdings" w:hAnsi="Wingdings" w:hint="default"/>
+        <w:sz w:val="20"/>
+      </w:rPr>
+    </w:lvl>
+    <w:lvl w:ilvl="8" w:tentative="1">
+      <w:start w:val="1"/>
+      <w:numFmt w:val="bullet"/>
+      <w:lvlText w:val=""/>
+      <w:lvlJc w:val="left"/>
+      <w:pPr>
+        <w:tabs>
+          <w:tab w:val="num" w:pos="6480"/>
+        </w:tabs>
+        <w:ind w:left="6480" w:hanging="360"/>
+      </w:pPr>
+      <w:rPr>
+        <w:rFonts w:ascii="Wingdings" w:hAnsi="Wingdings" w:hint="default"/>
+        <w:sz w:val="20"/>
+      </w:rPr>
+    </w:lvl>
+  </w:abstractNum>
+  <w:abstractNum w:abstractNumId="24" w15:restartNumberingAfterBreak="0">
     <w:nsid w:val="59E32772"/>
     <w:multiLevelType w:val="hybridMultilevel"/>
     <w:tmpl w:val="8DA0CD50"/>
@@ -2505,7 +5632,305 @@
       </w:pPr>
     </w:lvl>
   </w:abstractNum>
-  <w:abstractNum w:abstractNumId="15" w15:restartNumberingAfterBreak="0">
+  <w:abstractNum w:abstractNumId="25" w15:restartNumberingAfterBreak="0">
+    <w:nsid w:val="5C7C5553"/>
+    <w:multiLevelType w:val="multilevel"/>
+    <w:tmpl w:val="30848504"/>
+    <w:lvl w:ilvl="0">
+      <w:start w:val="1"/>
+      <w:numFmt w:val="bullet"/>
+      <w:lvlText w:val=""/>
+      <w:lvlJc w:val="left"/>
+      <w:pPr>
+        <w:tabs>
+          <w:tab w:val="num" w:pos="720"/>
+        </w:tabs>
+        <w:ind w:left="720" w:hanging="360"/>
+      </w:pPr>
+      <w:rPr>
+        <w:rFonts w:ascii="Symbol" w:hAnsi="Symbol" w:hint="default"/>
+        <w:sz w:val="20"/>
+      </w:rPr>
+    </w:lvl>
+    <w:lvl w:ilvl="1" w:tentative="1">
+      <w:start w:val="1"/>
+      <w:numFmt w:val="bullet"/>
+      <w:lvlText w:val="o"/>
+      <w:lvlJc w:val="left"/>
+      <w:pPr>
+        <w:tabs>
+          <w:tab w:val="num" w:pos="1440"/>
+        </w:tabs>
+        <w:ind w:left="1440" w:hanging="360"/>
+      </w:pPr>
+      <w:rPr>
+        <w:rFonts w:ascii="Courier New" w:hAnsi="Courier New" w:hint="default"/>
+        <w:sz w:val="20"/>
+      </w:rPr>
+    </w:lvl>
+    <w:lvl w:ilvl="2" w:tentative="1">
+      <w:start w:val="1"/>
+      <w:numFmt w:val="bullet"/>
+      <w:lvlText w:val=""/>
+      <w:lvlJc w:val="left"/>
+      <w:pPr>
+        <w:tabs>
+          <w:tab w:val="num" w:pos="2160"/>
+        </w:tabs>
+        <w:ind w:left="2160" w:hanging="360"/>
+      </w:pPr>
+      <w:rPr>
+        <w:rFonts w:ascii="Wingdings" w:hAnsi="Wingdings" w:hint="default"/>
+        <w:sz w:val="20"/>
+      </w:rPr>
+    </w:lvl>
+    <w:lvl w:ilvl="3" w:tentative="1">
+      <w:start w:val="1"/>
+      <w:numFmt w:val="bullet"/>
+      <w:lvlText w:val=""/>
+      <w:lvlJc w:val="left"/>
+      <w:pPr>
+        <w:tabs>
+          <w:tab w:val="num" w:pos="2880"/>
+        </w:tabs>
+        <w:ind w:left="2880" w:hanging="360"/>
+      </w:pPr>
+      <w:rPr>
+        <w:rFonts w:ascii="Wingdings" w:hAnsi="Wingdings" w:hint="default"/>
+        <w:sz w:val="20"/>
+      </w:rPr>
+    </w:lvl>
+    <w:lvl w:ilvl="4" w:tentative="1">
+      <w:start w:val="1"/>
+      <w:numFmt w:val="bullet"/>
+      <w:lvlText w:val=""/>
+      <w:lvlJc w:val="left"/>
+      <w:pPr>
+        <w:tabs>
+          <w:tab w:val="num" w:pos="3600"/>
+        </w:tabs>
+        <w:ind w:left="3600" w:hanging="360"/>
+      </w:pPr>
+      <w:rPr>
+        <w:rFonts w:ascii="Wingdings" w:hAnsi="Wingdings" w:hint="default"/>
+        <w:sz w:val="20"/>
+      </w:rPr>
+    </w:lvl>
+    <w:lvl w:ilvl="5" w:tentative="1">
+      <w:start w:val="1"/>
+      <w:numFmt w:val="bullet"/>
+      <w:lvlText w:val=""/>
+      <w:lvlJc w:val="left"/>
+      <w:pPr>
+        <w:tabs>
+          <w:tab w:val="num" w:pos="4320"/>
+        </w:tabs>
+        <w:ind w:left="4320" w:hanging="360"/>
+      </w:pPr>
+      <w:rPr>
+        <w:rFonts w:ascii="Wingdings" w:hAnsi="Wingdings" w:hint="default"/>
+        <w:sz w:val="20"/>
+      </w:rPr>
+    </w:lvl>
+    <w:lvl w:ilvl="6" w:tentative="1">
+      <w:start w:val="1"/>
+      <w:numFmt w:val="bullet"/>
+      <w:lvlText w:val=""/>
+      <w:lvlJc w:val="left"/>
+      <w:pPr>
+        <w:tabs>
+          <w:tab w:val="num" w:pos="5040"/>
+        </w:tabs>
+        <w:ind w:left="5040" w:hanging="360"/>
+      </w:pPr>
+      <w:rPr>
+        <w:rFonts w:ascii="Wingdings" w:hAnsi="Wingdings" w:hint="default"/>
+        <w:sz w:val="20"/>
+      </w:rPr>
+    </w:lvl>
+    <w:lvl w:ilvl="7" w:tentative="1">
+      <w:start w:val="1"/>
+      <w:numFmt w:val="bullet"/>
+      <w:lvlText w:val=""/>
+      <w:lvlJc w:val="left"/>
+      <w:pPr>
+        <w:tabs>
+          <w:tab w:val="num" w:pos="5760"/>
+        </w:tabs>
+        <w:ind w:left="5760" w:hanging="360"/>
+      </w:pPr>
+      <w:rPr>
+        <w:rFonts w:ascii="Wingdings" w:hAnsi="Wingdings" w:hint="default"/>
+        <w:sz w:val="20"/>
+      </w:rPr>
+    </w:lvl>
+    <w:lvl w:ilvl="8" w:tentative="1">
+      <w:start w:val="1"/>
+      <w:numFmt w:val="bullet"/>
+      <w:lvlText w:val=""/>
+      <w:lvlJc w:val="left"/>
+      <w:pPr>
+        <w:tabs>
+          <w:tab w:val="num" w:pos="6480"/>
+        </w:tabs>
+        <w:ind w:left="6480" w:hanging="360"/>
+      </w:pPr>
+      <w:rPr>
+        <w:rFonts w:ascii="Wingdings" w:hAnsi="Wingdings" w:hint="default"/>
+        <w:sz w:val="20"/>
+      </w:rPr>
+    </w:lvl>
+  </w:abstractNum>
+  <w:abstractNum w:abstractNumId="26" w15:restartNumberingAfterBreak="0">
+    <w:nsid w:val="652D300B"/>
+    <w:multiLevelType w:val="multilevel"/>
+    <w:tmpl w:val="B27CC2D2"/>
+    <w:lvl w:ilvl="0">
+      <w:start w:val="1"/>
+      <w:numFmt w:val="bullet"/>
+      <w:lvlText w:val=""/>
+      <w:lvlJc w:val="left"/>
+      <w:pPr>
+        <w:tabs>
+          <w:tab w:val="num" w:pos="720"/>
+        </w:tabs>
+        <w:ind w:left="720" w:hanging="360"/>
+      </w:pPr>
+      <w:rPr>
+        <w:rFonts w:ascii="Symbol" w:hAnsi="Symbol" w:hint="default"/>
+        <w:sz w:val="20"/>
+      </w:rPr>
+    </w:lvl>
+    <w:lvl w:ilvl="1" w:tentative="1">
+      <w:start w:val="1"/>
+      <w:numFmt w:val="bullet"/>
+      <w:lvlText w:val="o"/>
+      <w:lvlJc w:val="left"/>
+      <w:pPr>
+        <w:tabs>
+          <w:tab w:val="num" w:pos="1440"/>
+        </w:tabs>
+        <w:ind w:left="1440" w:hanging="360"/>
+      </w:pPr>
+      <w:rPr>
+        <w:rFonts w:ascii="Courier New" w:hAnsi="Courier New" w:hint="default"/>
+        <w:sz w:val="20"/>
+      </w:rPr>
+    </w:lvl>
+    <w:lvl w:ilvl="2" w:tentative="1">
+      <w:start w:val="1"/>
+      <w:numFmt w:val="bullet"/>
+      <w:lvlText w:val=""/>
+      <w:lvlJc w:val="left"/>
+      <w:pPr>
+        <w:tabs>
+          <w:tab w:val="num" w:pos="2160"/>
+        </w:tabs>
+        <w:ind w:left="2160" w:hanging="360"/>
+      </w:pPr>
+      <w:rPr>
+        <w:rFonts w:ascii="Wingdings" w:hAnsi="Wingdings" w:hint="default"/>
+        <w:sz w:val="20"/>
+      </w:rPr>
+    </w:lvl>
+    <w:lvl w:ilvl="3" w:tentative="1">
+      <w:start w:val="1"/>
+      <w:numFmt w:val="bullet"/>
+      <w:lvlText w:val=""/>
+      <w:lvlJc w:val="left"/>
+      <w:pPr>
+        <w:tabs>
+          <w:tab w:val="num" w:pos="2880"/>
+        </w:tabs>
+        <w:ind w:left="2880" w:hanging="360"/>
+      </w:pPr>
+      <w:rPr>
+        <w:rFonts w:ascii="Wingdings" w:hAnsi="Wingdings" w:hint="default"/>
+        <w:sz w:val="20"/>
+      </w:rPr>
+    </w:lvl>
+    <w:lvl w:ilvl="4" w:tentative="1">
+      <w:start w:val="1"/>
+      <w:numFmt w:val="bullet"/>
+      <w:lvlText w:val=""/>
+      <w:lvlJc w:val="left"/>
+      <w:pPr>
+        <w:tabs>
+          <w:tab w:val="num" w:pos="3600"/>
+        </w:tabs>
+        <w:ind w:left="3600" w:hanging="360"/>
+      </w:pPr>
+      <w:rPr>
+        <w:rFonts w:ascii="Wingdings" w:hAnsi="Wingdings" w:hint="default"/>
+        <w:sz w:val="20"/>
+      </w:rPr>
+    </w:lvl>
+    <w:lvl w:ilvl="5" w:tentative="1">
+      <w:start w:val="1"/>
+      <w:numFmt w:val="bullet"/>
+      <w:lvlText w:val=""/>
+      <w:lvlJc w:val="left"/>
+      <w:pPr>
+        <w:tabs>
+          <w:tab w:val="num" w:pos="4320"/>
+        </w:tabs>
+        <w:ind w:left="4320" w:hanging="360"/>
+      </w:pPr>
+      <w:rPr>
+        <w:rFonts w:ascii="Wingdings" w:hAnsi="Wingdings" w:hint="default"/>
+        <w:sz w:val="20"/>
+      </w:rPr>
+    </w:lvl>
+    <w:lvl w:ilvl="6" w:tentative="1">
+      <w:start w:val="1"/>
+      <w:numFmt w:val="bullet"/>
+      <w:lvlText w:val=""/>
+      <w:lvlJc w:val="left"/>
+      <w:pPr>
+        <w:tabs>
+          <w:tab w:val="num" w:pos="5040"/>
+        </w:tabs>
+        <w:ind w:left="5040" w:hanging="360"/>
+      </w:pPr>
+      <w:rPr>
+        <w:rFonts w:ascii="Wingdings" w:hAnsi="Wingdings" w:hint="default"/>
+        <w:sz w:val="20"/>
+      </w:rPr>
+    </w:lvl>
+    <w:lvl w:ilvl="7" w:tentative="1">
+      <w:start w:val="1"/>
+      <w:numFmt w:val="bullet"/>
+      <w:lvlText w:val=""/>
+      <w:lvlJc w:val="left"/>
+      <w:pPr>
+        <w:tabs>
+          <w:tab w:val="num" w:pos="5760"/>
+        </w:tabs>
+        <w:ind w:left="5760" w:hanging="360"/>
+      </w:pPr>
+      <w:rPr>
+        <w:rFonts w:ascii="Wingdings" w:hAnsi="Wingdings" w:hint="default"/>
+        <w:sz w:val="20"/>
+      </w:rPr>
+    </w:lvl>
+    <w:lvl w:ilvl="8" w:tentative="1">
+      <w:start w:val="1"/>
+      <w:numFmt w:val="bullet"/>
+      <w:lvlText w:val=""/>
+      <w:lvlJc w:val="left"/>
+      <w:pPr>
+        <w:tabs>
+          <w:tab w:val="num" w:pos="6480"/>
+        </w:tabs>
+        <w:ind w:left="6480" w:hanging="360"/>
+      </w:pPr>
+      <w:rPr>
+        <w:rFonts w:ascii="Wingdings" w:hAnsi="Wingdings" w:hint="default"/>
+        <w:sz w:val="20"/>
+      </w:rPr>
+    </w:lvl>
+  </w:abstractNum>
+  <w:abstractNum w:abstractNumId="27" w15:restartNumberingAfterBreak="0">
     <w:nsid w:val="657E566D"/>
     <w:multiLevelType w:val="hybridMultilevel"/>
     <w:tmpl w:val="CA34C3EA"/>
@@ -2617,7 +6042,7 @@
       </w:rPr>
     </w:lvl>
   </w:abstractNum>
-  <w:abstractNum w:abstractNumId="16" w15:restartNumberingAfterBreak="0">
+  <w:abstractNum w:abstractNumId="28" w15:restartNumberingAfterBreak="0">
     <w:nsid w:val="71F16F42"/>
     <w:multiLevelType w:val="hybridMultilevel"/>
     <w:tmpl w:val="720EFEAA"/>
@@ -2729,7 +6154,156 @@
       </w:rPr>
     </w:lvl>
   </w:abstractNum>
-  <w:abstractNum w:abstractNumId="17" w15:restartNumberingAfterBreak="0">
+  <w:abstractNum w:abstractNumId="29" w15:restartNumberingAfterBreak="0">
+    <w:nsid w:val="74FA5A34"/>
+    <w:multiLevelType w:val="multilevel"/>
+    <w:tmpl w:val="9CBEAC2C"/>
+    <w:lvl w:ilvl="0">
+      <w:start w:val="1"/>
+      <w:numFmt w:val="bullet"/>
+      <w:lvlText w:val=""/>
+      <w:lvlJc w:val="left"/>
+      <w:pPr>
+        <w:tabs>
+          <w:tab w:val="num" w:pos="720"/>
+        </w:tabs>
+        <w:ind w:left="720" w:hanging="360"/>
+      </w:pPr>
+      <w:rPr>
+        <w:rFonts w:ascii="Symbol" w:hAnsi="Symbol" w:hint="default"/>
+        <w:sz w:val="20"/>
+      </w:rPr>
+    </w:lvl>
+    <w:lvl w:ilvl="1" w:tentative="1">
+      <w:start w:val="1"/>
+      <w:numFmt w:val="bullet"/>
+      <w:lvlText w:val="o"/>
+      <w:lvlJc w:val="left"/>
+      <w:pPr>
+        <w:tabs>
+          <w:tab w:val="num" w:pos="1440"/>
+        </w:tabs>
+        <w:ind w:left="1440" w:hanging="360"/>
+      </w:pPr>
+      <w:rPr>
+        <w:rFonts w:ascii="Courier New" w:hAnsi="Courier New" w:hint="default"/>
+        <w:sz w:val="20"/>
+      </w:rPr>
+    </w:lvl>
+    <w:lvl w:ilvl="2" w:tentative="1">
+      <w:start w:val="1"/>
+      <w:numFmt w:val="bullet"/>
+      <w:lvlText w:val=""/>
+      <w:lvlJc w:val="left"/>
+      <w:pPr>
+        <w:tabs>
+          <w:tab w:val="num" w:pos="2160"/>
+        </w:tabs>
+        <w:ind w:left="2160" w:hanging="360"/>
+      </w:pPr>
+      <w:rPr>
+        <w:rFonts w:ascii="Wingdings" w:hAnsi="Wingdings" w:hint="default"/>
+        <w:sz w:val="20"/>
+      </w:rPr>
+    </w:lvl>
+    <w:lvl w:ilvl="3" w:tentative="1">
+      <w:start w:val="1"/>
+      <w:numFmt w:val="bullet"/>
+      <w:lvlText w:val=""/>
+      <w:lvlJc w:val="left"/>
+      <w:pPr>
+        <w:tabs>
+          <w:tab w:val="num" w:pos="2880"/>
+        </w:tabs>
+        <w:ind w:left="2880" w:hanging="360"/>
+      </w:pPr>
+      <w:rPr>
+        <w:rFonts w:ascii="Wingdings" w:hAnsi="Wingdings" w:hint="default"/>
+        <w:sz w:val="20"/>
+      </w:rPr>
+    </w:lvl>
+    <w:lvl w:ilvl="4" w:tentative="1">
+      <w:start w:val="1"/>
+      <w:numFmt w:val="bullet"/>
+      <w:lvlText w:val=""/>
+      <w:lvlJc w:val="left"/>
+      <w:pPr>
+        <w:tabs>
+          <w:tab w:val="num" w:pos="3600"/>
+        </w:tabs>
+        <w:ind w:left="3600" w:hanging="360"/>
+      </w:pPr>
+      <w:rPr>
+        <w:rFonts w:ascii="Wingdings" w:hAnsi="Wingdings" w:hint="default"/>
+        <w:sz w:val="20"/>
+      </w:rPr>
+    </w:lvl>
+    <w:lvl w:ilvl="5" w:tentative="1">
+      <w:start w:val="1"/>
+      <w:numFmt w:val="bullet"/>
+      <w:lvlText w:val=""/>
+      <w:lvlJc w:val="left"/>
+      <w:pPr>
+        <w:tabs>
+          <w:tab w:val="num" w:pos="4320"/>
+        </w:tabs>
+        <w:ind w:left="4320" w:hanging="360"/>
+      </w:pPr>
+      <w:rPr>
+        <w:rFonts w:ascii="Wingdings" w:hAnsi="Wingdings" w:hint="default"/>
+        <w:sz w:val="20"/>
+      </w:rPr>
+    </w:lvl>
+    <w:lvl w:ilvl="6" w:tentative="1">
+      <w:start w:val="1"/>
+      <w:numFmt w:val="bullet"/>
+      <w:lvlText w:val=""/>
+      <w:lvlJc w:val="left"/>
+      <w:pPr>
+        <w:tabs>
+          <w:tab w:val="num" w:pos="5040"/>
+        </w:tabs>
+        <w:ind w:left="5040" w:hanging="360"/>
+      </w:pPr>
+      <w:rPr>
+        <w:rFonts w:ascii="Wingdings" w:hAnsi="Wingdings" w:hint="default"/>
+        <w:sz w:val="20"/>
+      </w:rPr>
+    </w:lvl>
+    <w:lvl w:ilvl="7" w:tentative="1">
+      <w:start w:val="1"/>
+      <w:numFmt w:val="bullet"/>
+      <w:lvlText w:val=""/>
+      <w:lvlJc w:val="left"/>
+      <w:pPr>
+        <w:tabs>
+          <w:tab w:val="num" w:pos="5760"/>
+        </w:tabs>
+        <w:ind w:left="5760" w:hanging="360"/>
+      </w:pPr>
+      <w:rPr>
+        <w:rFonts w:ascii="Wingdings" w:hAnsi="Wingdings" w:hint="default"/>
+        <w:sz w:val="20"/>
+      </w:rPr>
+    </w:lvl>
+    <w:lvl w:ilvl="8" w:tentative="1">
+      <w:start w:val="1"/>
+      <w:numFmt w:val="bullet"/>
+      <w:lvlText w:val=""/>
+      <w:lvlJc w:val="left"/>
+      <w:pPr>
+        <w:tabs>
+          <w:tab w:val="num" w:pos="6480"/>
+        </w:tabs>
+        <w:ind w:left="6480" w:hanging="360"/>
+      </w:pPr>
+      <w:rPr>
+        <w:rFonts w:ascii="Wingdings" w:hAnsi="Wingdings" w:hint="default"/>
+        <w:sz w:val="20"/>
+      </w:rPr>
+    </w:lvl>
+  </w:abstractNum>
+  <w:abstractNum w:abstractNumId="30" w15:restartNumberingAfterBreak="0">
     <w:nsid w:val="7D8B0A77"/>
     <w:multiLevelType w:val="multilevel"/>
     <w:tmpl w:val="6A70C780"/>
@@ -2879,58 +6453,97 @@
     </w:lvl>
   </w:abstractNum>
   <w:num w:numId="1" w16cid:durableId="1600674174">
+    <w:abstractNumId w:val="14"/>
+  </w:num>
+  <w:num w:numId="2" w16cid:durableId="1771897340">
+    <w:abstractNumId w:val="27"/>
+  </w:num>
+  <w:num w:numId="3" w16cid:durableId="78868865">
+    <w:abstractNumId w:val="1"/>
+  </w:num>
+  <w:num w:numId="4" w16cid:durableId="1111780670">
+    <w:abstractNumId w:val="5"/>
+  </w:num>
+  <w:num w:numId="5" w16cid:durableId="37751185">
+    <w:abstractNumId w:val="22"/>
+  </w:num>
+  <w:num w:numId="6" w16cid:durableId="706833326">
+    <w:abstractNumId w:val="21"/>
+  </w:num>
+  <w:num w:numId="7" w16cid:durableId="2009408531">
+    <w:abstractNumId w:val="11"/>
+  </w:num>
+  <w:num w:numId="8" w16cid:durableId="522137711">
+    <w:abstractNumId w:val="20"/>
+  </w:num>
+  <w:num w:numId="9" w16cid:durableId="1648902420">
+    <w:abstractNumId w:val="17"/>
+  </w:num>
+  <w:num w:numId="10" w16cid:durableId="1530297163">
+    <w:abstractNumId w:val="6"/>
+  </w:num>
+  <w:num w:numId="11" w16cid:durableId="708341057">
+    <w:abstractNumId w:val="24"/>
+  </w:num>
+  <w:num w:numId="12" w16cid:durableId="1149707316">
+    <w:abstractNumId w:val="28"/>
+  </w:num>
+  <w:num w:numId="13" w16cid:durableId="479929511">
+    <w:abstractNumId w:val="7"/>
+  </w:num>
+  <w:num w:numId="14" w16cid:durableId="1190608440">
+    <w:abstractNumId w:val="19"/>
+  </w:num>
+  <w:num w:numId="15" w16cid:durableId="110710660">
+    <w:abstractNumId w:val="30"/>
+  </w:num>
+  <w:num w:numId="16" w16cid:durableId="1150950155">
     <w:abstractNumId w:val="8"/>
   </w:num>
-  <w:num w:numId="2" w16cid:durableId="1771897340">
+  <w:num w:numId="17" w16cid:durableId="1105151978">
+    <w:abstractNumId w:val="4"/>
+  </w:num>
+  <w:num w:numId="18" w16cid:durableId="759326427">
+    <w:abstractNumId w:val="9"/>
+  </w:num>
+  <w:num w:numId="19" w16cid:durableId="2070885573">
+    <w:abstractNumId w:val="3"/>
+  </w:num>
+  <w:num w:numId="20" w16cid:durableId="496580777">
+    <w:abstractNumId w:val="13"/>
+  </w:num>
+  <w:num w:numId="21" w16cid:durableId="1439328882">
+    <w:abstractNumId w:val="29"/>
+  </w:num>
+  <w:num w:numId="22" w16cid:durableId="1061949392">
+    <w:abstractNumId w:val="26"/>
+  </w:num>
+  <w:num w:numId="23" w16cid:durableId="1469279670">
     <w:abstractNumId w:val="15"/>
   </w:num>
-  <w:num w:numId="3" w16cid:durableId="78868865">
+  <w:num w:numId="24" w16cid:durableId="1738093556">
+    <w:abstractNumId w:val="10"/>
+  </w:num>
+  <w:num w:numId="25" w16cid:durableId="1300644171">
+    <w:abstractNumId w:val="18"/>
+  </w:num>
+  <w:num w:numId="26" w16cid:durableId="584413583">
+    <w:abstractNumId w:val="2"/>
+  </w:num>
+  <w:num w:numId="27" w16cid:durableId="359471348">
+    <w:abstractNumId w:val="12"/>
+  </w:num>
+  <w:num w:numId="28" w16cid:durableId="1309898541">
     <w:abstractNumId w:val="0"/>
   </w:num>
-  <w:num w:numId="4" w16cid:durableId="1111780670">
-    <w:abstractNumId w:val="2"/>
+  <w:num w:numId="29" w16cid:durableId="458958011">
+    <w:abstractNumId w:val="23"/>
   </w:num>
-  <w:num w:numId="5" w16cid:durableId="37751185">
-    <w:abstractNumId w:val="13"/>
+  <w:num w:numId="30" w16cid:durableId="1203707653">
+    <w:abstractNumId w:val="25"/>
   </w:num>
-  <w:num w:numId="6" w16cid:durableId="706833326">
-    <w:abstractNumId w:val="12"/>
-  </w:num>
-  <w:num w:numId="7" w16cid:durableId="2009408531">
-    <w:abstractNumId w:val="7"/>
-  </w:num>
-  <w:num w:numId="8" w16cid:durableId="522137711">
-    <w:abstractNumId w:val="11"/>
-  </w:num>
-  <w:num w:numId="9" w16cid:durableId="1648902420">
-    <w:abstractNumId w:val="9"/>
-  </w:num>
-  <w:num w:numId="10" w16cid:durableId="1530297163">
-    <w:abstractNumId w:val="3"/>
-  </w:num>
-  <w:num w:numId="11" w16cid:durableId="708341057">
-    <w:abstractNumId w:val="14"/>
-  </w:num>
-  <w:num w:numId="12" w16cid:durableId="1149707316">
+  <w:num w:numId="31" w16cid:durableId="2125535463">
     <w:abstractNumId w:val="16"/>
-  </w:num>
-  <w:num w:numId="13" w16cid:durableId="479929511">
-    <w:abstractNumId w:val="4"/>
-  </w:num>
-  <w:num w:numId="14" w16cid:durableId="1190608440">
-    <w:abstractNumId w:val="10"/>
-  </w:num>
-  <w:num w:numId="15" w16cid:durableId="110710660">
-    <w:abstractNumId w:val="17"/>
-  </w:num>
-  <w:num w:numId="16" w16cid:durableId="1150950155">
-    <w:abstractNumId w:val="5"/>
-  </w:num>
-  <w:num w:numId="17" w16cid:durableId="1105151978">
-    <w:abstractNumId w:val="1"/>
-  </w:num>
-  <w:num w:numId="18" w16cid:durableId="759326427">
-    <w:abstractNumId w:val="6"/>
   </w:num>
 </w:numbering>
 </file>
@@ -3557,6 +7170,42 @@
       <w:shd w:val="clear" w:color="auto" w:fill="E1DFDD"/>
     </w:rPr>
   </w:style>
+  <w:style w:type="paragraph" w:styleId="NormalWeb">
+    <w:name w:val="Normal (Web)"/>
+    <w:basedOn w:val="Normal"/>
+    <w:uiPriority w:val="99"/>
+    <w:semiHidden/>
+    <w:unhideWhenUsed/>
+    <w:rsid w:val="004D2B97"/>
+    <w:pPr>
+      <w:spacing w:before="100" w:beforeAutospacing="1" w:after="100" w:afterAutospacing="1" w:line="240" w:lineRule="auto"/>
+      <w:ind w:firstLine="0"/>
+    </w:pPr>
+  </w:style>
+  <w:style w:type="character" w:styleId="Strong">
+    <w:name w:val="Strong"/>
+    <w:basedOn w:val="DefaultParagraphFont"/>
+    <w:uiPriority w:val="22"/>
+    <w:qFormat/>
+    <w:rsid w:val="004D2B97"/>
+    <w:rPr>
+      <w:b/>
+      <w:bCs/>
+    </w:rPr>
+  </w:style>
+  <w:style w:type="character" w:styleId="HTMLCode">
+    <w:name w:val="HTML Code"/>
+    <w:basedOn w:val="DefaultParagraphFont"/>
+    <w:uiPriority w:val="99"/>
+    <w:semiHidden/>
+    <w:unhideWhenUsed/>
+    <w:rsid w:val="004D2B97"/>
+    <w:rPr>
+      <w:rFonts w:ascii="Courier New" w:eastAsia="Times New Roman" w:hAnsi="Courier New" w:cs="Courier New"/>
+      <w:sz w:val="20"/>
+      <w:szCs w:val="20"/>
+    </w:rPr>
+  </w:style>
 </w:styles>
 </file>
 

</xml_diff>